<commit_message>
feat(ml): đo hiệu năng trên Raspberry Pi 5, chuyển bước kiểu dáng sang MobileNetV3-Small ONNX
- Script đo trên Pi: run_pi_benchmark.sh (ma trận số luồng x cấu hình model),
  pi_power_monitor.py (công suất từ PMIC qua vcgencmd pmic_read_adc),
  summarize_pi_benchmark.py, run_pi_ram.sh. Log gốc ở experiments/pi5/,
  notebook benchmark-raspberry-pi5.ipynb.
- benchmark_pipeline.py đọc ML_COARSE_WEIGHTS và ML_STYLE_ONNX, in tên model
  thật sự chạy vào đầu log. Bản cũ không đọc hai biến này nên lần đo trước
  gắn nhãn "onnx" nhưng vẫn chạy .pt; log lần đó giữ ở pi5_lan2_nhan_onnx_sai/.
- Xuất vehicle-style-mobilenet_v3_small.onnx, khớp .pt 987/987 ảnh test,
  đặt làm model kiểu dáng mặc định.
- Sửa đường dẫn plate_weights mặc định trỏ tới best.pt không tồn tại, cập
  nhật test smoke theo khoá timings_ms/resources, bổ sung biến ML_* vào
  .env.example.
- Báo cáo w7 mục 2.3 và chương 5: kết quả Pi, 495,3 ms mỗi lượt ở 4 luồng.
</commit_message>
<xml_diff>
--- a/docs/report/chapters/w7-onnx.docx
+++ b/docs/report/chapters/w7-onnx.docx
@@ -1166,13 +1166,28 @@
         <w:pStyle w:val="Heading2"/>
       </w:pPr>
       <w:r>
-        <w:t>2.3 Việc còn tồn: đo trên Raspberry Pi 5</w:t>
+        <w:rPr>
+          <w:b w:val="0"/>
+        </w:rPr>
+        <w:t>2.3 Đo trên Raspberry Pi 5</w:t>
       </w:r>
     </w:p>
     <w:p>
       <w:pPr/>
       <w:r>
-        <w:t>Toàn bộ số liệu ở trên đo trên máy phát triển x86, chưa phải thiết bị triển khai thật, nên chưa trả lời được câu hỏi quan trọng nhất là hệ thống có chạy đủ nhanh trên Pi hay không. Dự kiến làm ở tuần sau, dùng đúng script benchmark_pipeline.py này để hai bên số liệu so sánh được với nhau. Ba điểm cần lưu ý khi đo trên Pi:</w:t>
+        <w:rPr>
+          <w:b w:val="0"/>
+        </w:rPr>
+        <w:t>Đo lại trên Raspberry Pi 5 16GB (Debian 13, thẻ microSD, quạt chủ động, nguồn 3A) bằng đúng benchmark_pipeline.py, chạy qua src/ml/run_pi_benchmark.sh. Log gốc ở src/ml/experiments/pi5/, bảng và kiểm tra chi tiết ở notebook src/ml/notebooks/benchmark-raspberry-pi5.ipynb.</w:t>
+      </w:r>
+    </w:p>
+    <w:p>
+      <w:pPr/>
+      <w:r>
+        <w:rPr>
+          <w:b/>
+        </w:rPr>
+        <w:t>Cách đo.</w:t>
       </w:r>
     </w:p>
     <w:p>
@@ -1180,7 +1195,10 @@
         <w:pStyle w:val="ListBullet"/>
       </w:pPr>
       <w:r>
-        <w:t>Số luồng tối ưu nhiều khả năng khác hẳn. Pi chỉ có 4 lõi, trong khi máy dev có 24 luồng logic. Giá trị mặc định ML_INTRAOP_THREADS=1 được chọn chính vì lý do này, nhưng vẫn phải đo lại để xác nhận thay vì suy đoán.</w:t>
+        <w:rPr>
+          <w:b w:val="0"/>
+        </w:rPr>
+        <w:t>Thời gian: time.perf_counter(), bỏ 3 lượt làm nóng, lấy trung vị 10 lượt gọi OnnxAlprPipeline.run() trên ảnh mẫu 12 biển số. Mỗi log in tên model thật sự chạy.</w:t>
       </w:r>
     </w:p>
     <w:p>
@@ -1188,7 +1206,10 @@
         <w:pStyle w:val="ListBullet"/>
       </w:pPr>
       <w:r>
-        <w:t>Có thể không cài torch trên Pi. Bước định vị xe mặc định chạy qua ultralytics nên kéo theo torch, khá nặng với Pi. Nếu muốn chạy hoàn toàn không cần torch thì trỏ ML_COARSE_WEIGHTS sang bản .onnx để dùng nhánh onnxruntime thuần. Lúc đó cần đo cả 2 nhánh để biết trên ARM nhánh nào thật sự nhanh hơn: trên x86 nhánh .pt nhanh hơn (147,3 ms so với 218,5 ms cùng điều kiện), nhưng ARM không có các tối ưu CPU như x86 nên kết quả có thể ngược lại.</w:t>
+        <w:rPr>
+          <w:b w:val="0"/>
+        </w:rPr>
+        <w:t>Điện năng: chip quản lý nguồn của Pi 5 (PMIC Renesas DA9091) có ADC đo dòng và áp từng nhánh nguồn, đọc bằng vcgencmd pmic_read_adc mỗi giây. Công suất P = Σ V_k × I_k, điện năng mỗi lượt xe E = P khi chạy liên tục × thời gian mỗi lượt. Số này là cận dưới của điện năng ở ổ cắm vì không tính củ sạc, quạt và thiết bị USB.</w:t>
       </w:r>
     </w:p>
     <w:p>
@@ -1196,7 +1217,390 @@
         <w:pStyle w:val="ListBullet"/>
       </w:pPr>
       <w:r>
-        <w:t>Đo cả nhiệt độ và xung nhịp. Pi bị giảm xung khi nóng, nên số đo lần đầu chạy nguội có thể đẹp hơn thực tế lúc chạy liên tục ở trạm cổng.</w:t>
+        <w:rPr>
+          <w:b w:val="0"/>
+        </w:rPr>
+        <w:t>Điều kiện hợp lệ: cờ vcgencmd get_throttled không báo hạ xung hay sụt áp ở mẫu nào (0/1.452 mẫu); công suất đi theo tải CPU (hệ số tương quan 0,944). Cùng một cấu hình đo lặp 5 lần, trung vị lệch nhau không quá 1,04%.</w:t>
+      </w:r>
+    </w:p>
+    <w:p>
+      <w:pPr/>
+      <w:r>
+        <w:rPr>
+          <w:b/>
+        </w:rPr>
+        <w:t>Kết quả</w:t>
+      </w:r>
+      <w:r>
+        <w:rPr>
+          <w:b w:val="0"/>
+        </w:rPr>
+        <w:t xml:space="preserve"> (trung vị mỗi lượt xe):</w:t>
+      </w:r>
+    </w:p>
+    <w:tbl>
+      <w:tblPr>
+        <w:tblStyle w:val="TableGrid"/>
+        <w:tblW w:type="auto" w:w="0"/>
+        <w:tblLook w:firstColumn="1" w:firstRow="1" w:lastColumn="0" w:lastRow="0" w:noHBand="0" w:noVBand="1" w:val="04A0"/>
+      </w:tblPr>
+      <w:tblGrid>
+        <w:gridCol w:w="1872"/>
+        <w:gridCol w:w="1872"/>
+        <w:gridCol w:w="1872"/>
+        <w:gridCol w:w="1872"/>
+        <w:gridCol w:w="1872"/>
+      </w:tblGrid>
+      <w:tr>
+        <w:tc>
+          <w:tcPr>
+            <w:tcW w:type="dxa" w:w="1872"/>
+          </w:tcPr>
+          <w:p>
+            <w:r/>
+            <w:r>
+              <w:rPr>
+                <w:b/>
+                <w:sz w:val="20"/>
+              </w:rPr>
+              <w:t>Định vị xe</w:t>
+            </w:r>
+          </w:p>
+        </w:tc>
+        <w:tc>
+          <w:tcPr>
+            <w:tcW w:type="dxa" w:w="1872"/>
+          </w:tcPr>
+          <w:p>
+            <w:r/>
+            <w:r>
+              <w:rPr>
+                <w:b/>
+                <w:sz w:val="20"/>
+              </w:rPr>
+              <w:t>Kiểu dáng</w:t>
+            </w:r>
+          </w:p>
+        </w:tc>
+        <w:tc>
+          <w:tcPr>
+            <w:tcW w:type="dxa" w:w="1872"/>
+          </w:tcPr>
+          <w:p>
+            <w:r/>
+            <w:r>
+              <w:rPr>
+                <w:b/>
+                <w:sz w:val="20"/>
+              </w:rPr>
+              <w:t>1 luồng</w:t>
+            </w:r>
+          </w:p>
+        </w:tc>
+        <w:tc>
+          <w:tcPr>
+            <w:tcW w:type="dxa" w:w="1872"/>
+          </w:tcPr>
+          <w:p>
+            <w:r/>
+            <w:r>
+              <w:rPr>
+                <w:b/>
+                <w:sz w:val="20"/>
+              </w:rPr>
+              <w:t>4 luồng</w:t>
+            </w:r>
+          </w:p>
+        </w:tc>
+        <w:tc>
+          <w:tcPr>
+            <w:tcW w:type="dxa" w:w="1872"/>
+          </w:tcPr>
+          <w:p>
+            <w:r/>
+            <w:r>
+              <w:rPr>
+                <w:b/>
+                <w:sz w:val="20"/>
+              </w:rPr>
+              <w:t>Điện năng, 4 luồng</w:t>
+            </w:r>
+          </w:p>
+        </w:tc>
+      </w:tr>
+      <w:tr>
+        <w:tc>
+          <w:tcPr>
+            <w:tcW w:type="dxa" w:w="1872"/>
+          </w:tcPr>
+          <w:p>
+            <w:r/>
+            <w:r>
+              <w:rPr>
+                <w:b w:val="0"/>
+                <w:sz w:val="20"/>
+              </w:rPr>
+              <w:t>.pt</w:t>
+            </w:r>
+          </w:p>
+        </w:tc>
+        <w:tc>
+          <w:tcPr>
+            <w:tcW w:type="dxa" w:w="1872"/>
+          </w:tcPr>
+          <w:p>
+            <w:r/>
+            <w:r>
+              <w:rPr>
+                <w:b w:val="0"/>
+                <w:sz w:val="20"/>
+              </w:rPr>
+              <w:t>ResNet18</w:t>
+            </w:r>
+          </w:p>
+        </w:tc>
+        <w:tc>
+          <w:tcPr>
+            <w:tcW w:type="dxa" w:w="1872"/>
+          </w:tcPr>
+          <w:p>
+            <w:r/>
+            <w:r>
+              <w:rPr>
+                <w:b w:val="0"/>
+                <w:sz w:val="20"/>
+              </w:rPr>
+              <w:t>813,9 ms</w:t>
+            </w:r>
+          </w:p>
+        </w:tc>
+        <w:tc>
+          <w:tcPr>
+            <w:tcW w:type="dxa" w:w="1872"/>
+          </w:tcPr>
+          <w:p>
+            <w:r/>
+            <w:r>
+              <w:rPr>
+                <w:b/>
+                <w:sz w:val="20"/>
+              </w:rPr>
+              <w:t>495,3 ms</w:t>
+            </w:r>
+          </w:p>
+        </w:tc>
+        <w:tc>
+          <w:tcPr>
+            <w:tcW w:type="dxa" w:w="1872"/>
+          </w:tcPr>
+          <w:p>
+            <w:r/>
+            <w:r>
+              <w:rPr>
+                <w:b w:val="0"/>
+                <w:sz w:val="20"/>
+              </w:rPr>
+              <w:t>3,2 J</w:t>
+            </w:r>
+          </w:p>
+        </w:tc>
+      </w:tr>
+      <w:tr>
+        <w:tc>
+          <w:tcPr>
+            <w:tcW w:type="dxa" w:w="1872"/>
+          </w:tcPr>
+          <w:p>
+            <w:r/>
+            <w:r>
+              <w:rPr>
+                <w:b w:val="0"/>
+                <w:sz w:val="20"/>
+              </w:rPr>
+              <w:t>.onnx</w:t>
+            </w:r>
+          </w:p>
+        </w:tc>
+        <w:tc>
+          <w:tcPr>
+            <w:tcW w:type="dxa" w:w="1872"/>
+          </w:tcPr>
+          <w:p>
+            <w:r/>
+            <w:r>
+              <w:rPr>
+                <w:b w:val="0"/>
+                <w:sz w:val="20"/>
+              </w:rPr>
+              <w:t>ResNet18</w:t>
+            </w:r>
+          </w:p>
+        </w:tc>
+        <w:tc>
+          <w:tcPr>
+            <w:tcW w:type="dxa" w:w="1872"/>
+          </w:tcPr>
+          <w:p>
+            <w:r/>
+            <w:r>
+              <w:rPr>
+                <w:b w:val="0"/>
+                <w:sz w:val="20"/>
+              </w:rPr>
+              <w:t>1.067,4 ms</w:t>
+            </w:r>
+          </w:p>
+        </w:tc>
+        <w:tc>
+          <w:tcPr>
+            <w:tcW w:type="dxa" w:w="1872"/>
+          </w:tcPr>
+          <w:p>
+            <w:r/>
+            <w:r>
+              <w:rPr>
+                <w:b w:val="0"/>
+                <w:sz w:val="20"/>
+              </w:rPr>
+              <w:t>535,0 ms</w:t>
+            </w:r>
+          </w:p>
+        </w:tc>
+        <w:tc>
+          <w:tcPr>
+            <w:tcW w:type="dxa" w:w="1872"/>
+          </w:tcPr>
+          <w:p>
+            <w:r/>
+            <w:r>
+              <w:rPr>
+                <w:b w:val="0"/>
+                <w:sz w:val="20"/>
+              </w:rPr>
+              <w:t>3,7 J</w:t>
+            </w:r>
+          </w:p>
+        </w:tc>
+      </w:tr>
+      <w:tr>
+        <w:tc>
+          <w:tcPr>
+            <w:tcW w:type="dxa" w:w="1872"/>
+          </w:tcPr>
+          <w:p>
+            <w:r/>
+            <w:r>
+              <w:rPr>
+                <w:b w:val="0"/>
+                <w:sz w:val="20"/>
+              </w:rPr>
+              <w:t>.onnx</w:t>
+            </w:r>
+          </w:p>
+        </w:tc>
+        <w:tc>
+          <w:tcPr>
+            <w:tcW w:type="dxa" w:w="1872"/>
+          </w:tcPr>
+          <w:p>
+            <w:r/>
+            <w:r>
+              <w:rPr>
+                <w:b w:val="0"/>
+                <w:sz w:val="20"/>
+              </w:rPr>
+              <w:t>MobileNetV3-Small</w:t>
+            </w:r>
+          </w:p>
+        </w:tc>
+        <w:tc>
+          <w:tcPr>
+            <w:tcW w:type="dxa" w:w="1872"/>
+          </w:tcPr>
+          <w:p>
+            <w:r/>
+            <w:r>
+              <w:rPr>
+                <w:b w:val="0"/>
+                <w:sz w:val="20"/>
+              </w:rPr>
+              <w:t>1.082,4 ms</w:t>
+            </w:r>
+          </w:p>
+        </w:tc>
+        <w:tc>
+          <w:tcPr>
+            <w:tcW w:type="dxa" w:w="1872"/>
+          </w:tcPr>
+          <w:p>
+            <w:r/>
+            <w:r>
+              <w:rPr>
+                <w:b w:val="0"/>
+                <w:sz w:val="20"/>
+              </w:rPr>
+              <w:t>550,4 ms</w:t>
+            </w:r>
+          </w:p>
+        </w:tc>
+        <w:tc>
+          <w:tcPr>
+            <w:tcW w:type="dxa" w:w="1872"/>
+          </w:tcPr>
+          <w:p>
+            <w:r/>
+            <w:r>
+              <w:rPr>
+                <w:b w:val="0"/>
+                <w:sz w:val="20"/>
+              </w:rPr>
+              <w:t>3,7 J</w:t>
+            </w:r>
+          </w:p>
+        </w:tc>
+      </w:tr>
+    </w:tbl>
+    <w:p>
+      <w:pPr/>
+    </w:p>
+    <w:p>
+      <w:pPr/>
+      <w:r>
+        <w:rPr>
+          <w:b w:val="0"/>
+        </w:rPr>
+        <w:t>Riêng bước kiểu dáng: ResNet18 mất 132,3 ms (1 luồng) và 75,8 ms (4 luồng), MobileNetV3-Small mất 16,0 ms và 27,8 ms. Bảng trên không thấy khác biệt vì ảnh đo là xe máy, pipeline chỉ chạy bước kiểu dáng với ô tô.</w:t>
+      </w:r>
+    </w:p>
+    <w:p>
+      <w:pPr/>
+      <w:r>
+        <w:rPr>
+          <w:b/>
+        </w:rPr>
+        <w:t>Kết luận.</w:t>
+      </w:r>
+    </w:p>
+    <w:p>
+      <w:pPr>
+        <w:pStyle w:val="ListBullet"/>
+      </w:pPr>
+      <w:r>
+        <w:rPr>
+          <w:b w:val="0"/>
+        </w:rPr>
+        <w:t>Đạt mốc đề cương: 495,3 ms mỗi lượt, nhanh hơn mốc 2 giây khoảng 4 lần. Lúc nghỉ Pi tiêu khoảng 1,5 W.</w:t>
+      </w:r>
+    </w:p>
+    <w:p>
+      <w:pPr>
+        <w:pStyle w:val="ListBullet"/>
+      </w:pPr>
+      <w:r>
+        <w:rPr>
+          <w:b w:val="0"/>
+        </w:rPr>
+        <w:t>Cấu hình triển khai trên Pi: 4 luồng, định vị xe bằng .pt (bản .onnx chậm hơn 8% đến 31%), kiểu dáng bằng MobileNetV3-Small ONNX. Bản ONNX khớp .pt trên 987/987 ảnh test, accuracy giữ nguyên 0,9007.</w:t>
       </w:r>
     </w:p>
     <w:p>
@@ -1367,6 +1771,17 @@
       </w:pPr>
       <w:r>
         <w:t>Đo được hiệu năng suy luận thật trên CPU bằng script tái lập được: toàn pipeline 146,8 ms mỗi ảnh ở cấu hình mặc định và 76,2 ms trên máy nhiều lõi, sau khi sửa 2 lỗi hiệu năng phát hiện trong lúc đo (nạp lại model mỗi khung hình, và tranh chấp luồng CPU giữa các model).</w:t>
+      </w:r>
+    </w:p>
+    <w:p>
+      <w:pPr>
+        <w:pStyle w:val="ListBullet"/>
+      </w:pPr>
+      <w:r>
+        <w:rPr>
+          <w:b w:val="0"/>
+        </w:rPr>
+        <w:t>Đo trên Raspberry Pi 5 thật: toàn pipeline 495,3 ms mỗi lượt ở 4 luồng, nhanh hơn mốc 2 giây của đề cương khoảng 4 lần; điện năng khoảng 3,2 J mỗi lượt xe, đo bằng ADC của chip quản lý nguồn. Xuất MobileNetV3-Small ONNX cho bước kiểu dáng (khớp .pt 987/987 ảnh), bước này nhanh hơn 8 lần trên Pi.</w:t>
       </w:r>
     </w:p>
     <w:sectPr>

</xml_diff>

<commit_message>
feat(ml): đo Pi 5 trên 50 ảnh camera cổng thật, đo đầu-cuối qua API
Lần đo trước chỉ dùng 1 ảnh xe máy 12 biển, không đo qua API, và điện năng tính
trên cửa sổ trộn nhiều loại tải. Bổ sung:

- benchmark_anh_that.py: 50 ảnh cổng thật (25 ô tô, 25 xe máy, seed cố định),
  ghi kết quả nhận dạng từng ảnh để so với máy dev. Trên Pi (4 luồng, .pt +
  MobileNetV3-Small): trung vị 462,4 ms, p90 488,0 ms; trùng máy dev 50/50 ảnh.
- do_tre_api.py: gọi POST /captures/infer trên backend riêng trỏ bản sao DB.
  Đầu-cuối 464,0 ms, phần ngoài suy luận 16,5 ms tính trên cùng request, lượt
  đầu nạp model 4,8 giây.
- Điện năng chỉ tính trong khoảng gọi run(): 3,14 J mỗi lượt.

Báo cáo bỏ các số không đáng tin (điện năng cũ, thời gian bước kiểu dáng đo
trong pipeline) và thay bằng kết quả trên.
</commit_message>
<xml_diff>
--- a/docs/report/chapters/w7-onnx.docx
+++ b/docs/report/chapters/w7-onnx.docx
@@ -1178,7 +1178,7 @@
         <w:rPr>
           <w:b w:val="0"/>
         </w:rPr>
-        <w:t>Đo lại trên Raspberry Pi 5 16GB (Debian 13, thẻ microSD, quạt chủ động, nguồn 3A) bằng đúng benchmark_pipeline.py, chạy qua src/ml/run_pi_benchmark.sh. Log gốc ở src/ml/experiments/pi5/, bảng và kiểm tra chi tiết ở notebook src/ml/notebooks/benchmark-raspberry-pi5.ipynb.</w:t>
+        <w:t>Đo trên Raspberry Pi 5 16GB (Debian 13, thẻ microSD, nguồn 3A) với đúng cấu hình backend đang chạy: 4 luồng, định vị xe bằng .pt, kiểu dáng bằng MobileNetV3-Small ONNX. Log gốc ở src/ml/experiments/pi5_anh_that/ và src/ml/experiments/pi5_do_tre_api/.</w:t>
       </w:r>
     </w:p>
     <w:p>
@@ -1198,7 +1198,7 @@
         <w:rPr>
           <w:b w:val="0"/>
         </w:rPr>
-        <w:t>Thời gian: time.perf_counter(), bỏ 3 lượt làm nóng, lấy trung vị 10 lượt gọi OnnxAlprPipeline.run() trên ảnh mẫu 12 biển số. Mỗi log in tên model thật sự chạy.</w:t>
+        <w:t>Ảnh: 50 ảnh camera cổng thật (25 ô tô, 25 xe máy), lấy ngẫu nhiên với seed cố định từ tập val của A1. Danh sách ở src/ml/data/anh_cong_benchmark.txt.</w:t>
       </w:r>
     </w:p>
     <w:p>
@@ -1209,7 +1209,7 @@
         <w:rPr>
           <w:b w:val="0"/>
         </w:rPr>
-        <w:t>Điện năng: chip quản lý nguồn của Pi 5 (PMIC Renesas DA9091) có ADC đo dòng và áp từng nhánh nguồn, đọc bằng vcgencmd pmic_read_adc mỗi giây. Công suất P = Σ V_k × I_k, điện năng mỗi lượt xe E = P khi chạy liên tục × thời gian mỗi lượt. Số này là cận dưới của điện năng ở ổ cắm vì không tính củ sạc, quạt và thiết bị USB.</w:t>
+        <w:t>Thời gian suy luận: benchmark_anh_that.py gọi OnnxAlprPipeline.run() 5 vòng mỗi ảnh bằng đồng hồ time.perf_counter(), lấy trung vị từng ảnh rồi báo trung vị và phân vị 90 trên 50 ảnh. Không tính đọc ảnh từ đĩa.</w:t>
       </w:r>
     </w:p>
     <w:p>
@@ -1220,7 +1220,29 @@
         <w:rPr>
           <w:b w:val="0"/>
         </w:rPr>
-        <w:t>Điều kiện hợp lệ: cờ vcgencmd get_throttled không báo hạ xung hay sụt áp ở mẫu nào (0/1.452 mẫu); công suất đi theo tải CPU (hệ số tương quan 0,944). Cùng một cấu hình đo lặp 5 lần, trung vị lệch nhau không quá 1,04%.</w:t>
+        <w:t>Độ trễ đầu-cuối: do_tre_api.py gọi POST /captures/infer của backend thật trên Pi, 3 vòng mỗi ảnh, tính từ lúc gửi tới lúc nhận phản hồi. Phần ngoài suy luận tính trên cùng một request: thời gian phía client trừ thời gian suy luận backend tự đo. Chưa gồm độ trễ mạng LAN.</w:t>
+      </w:r>
+    </w:p>
+    <w:p>
+      <w:pPr>
+        <w:pStyle w:val="ListBullet"/>
+      </w:pPr>
+      <w:r>
+        <w:rPr>
+          <w:b w:val="0"/>
+        </w:rPr>
+        <w:t>Điện năng: chip quản lý nguồn của Pi 5 (PMIC) có ADC đo dòng và áp từng nhánh nguồn, đọc bằng vcgencmd pmic_read_adc mỗi giây, P = Σ V_k × I_k. Trong khoảng đo chỉ có vòng gọi run(), nên E mỗi lượt = P trung bình × thời gian đo / số lượt. Số này là cận dưới của điện năng ở ổ cắm vì không tính củ sạc và thiết bị USB.</w:t>
+      </w:r>
+    </w:p>
+    <w:p>
+      <w:pPr>
+        <w:pStyle w:val="ListBullet"/>
+      </w:pPr>
+      <w:r>
+        <w:rPr>
+          <w:b w:val="0"/>
+        </w:rPr>
+        <w:t>Kiểm tra kết quả: so chuỗi biển, loại xe và kiểu dáng của từng ảnh trên Pi với cùng cấu hình chạy trên máy dev.</w:t>
       </w:r>
     </w:p>
     <w:p>
@@ -1229,13 +1251,7 @@
         <w:rPr>
           <w:b/>
         </w:rPr>
-        <w:t>Kết quả</w:t>
-      </w:r>
-      <w:r>
-        <w:rPr>
-          <w:b w:val="0"/>
-        </w:rPr>
-        <w:t xml:space="preserve"> (trung vị mỗi lượt xe):</w:t>
+        <w:t>Kết quả.</w:t>
       </w:r>
     </w:p>
     <w:tbl>
@@ -1245,16 +1261,13 @@
         <w:tblLook w:firstColumn="1" w:firstRow="1" w:lastColumn="0" w:lastRow="0" w:noHBand="0" w:noVBand="1" w:val="04A0"/>
       </w:tblPr>
       <w:tblGrid>
-        <w:gridCol w:w="1872"/>
-        <w:gridCol w:w="1872"/>
-        <w:gridCol w:w="1872"/>
-        <w:gridCol w:w="1872"/>
-        <w:gridCol w:w="1872"/>
+        <w:gridCol w:w="4680"/>
+        <w:gridCol w:w="4680"/>
       </w:tblGrid>
       <w:tr>
         <w:tc>
           <w:tcPr>
-            <w:tcW w:type="dxa" w:w="1872"/>
+            <w:tcW w:type="dxa" w:w="4680"/>
           </w:tcPr>
           <w:p>
             <w:r/>
@@ -1263,13 +1276,13 @@
                 <w:b/>
                 <w:sz w:val="20"/>
               </w:rPr>
-              <w:t>Định vị xe</w:t>
-            </w:r>
-          </w:p>
-        </w:tc>
-        <w:tc>
-          <w:tcPr>
-            <w:tcW w:type="dxa" w:w="1872"/>
+              <w:t>Chỉ số</w:t>
+            </w:r>
+          </w:p>
+        </w:tc>
+        <w:tc>
+          <w:tcPr>
+            <w:tcW w:type="dxa" w:w="4680"/>
           </w:tcPr>
           <w:p>
             <w:r/>
@@ -1278,52 +1291,7 @@
                 <w:b/>
                 <w:sz w:val="20"/>
               </w:rPr>
-              <w:t>Kiểu dáng</w:t>
-            </w:r>
-          </w:p>
-        </w:tc>
-        <w:tc>
-          <w:tcPr>
-            <w:tcW w:type="dxa" w:w="1872"/>
-          </w:tcPr>
-          <w:p>
-            <w:r/>
-            <w:r>
-              <w:rPr>
-                <w:b/>
-                <w:sz w:val="20"/>
-              </w:rPr>
-              <w:t>1 luồng</w:t>
-            </w:r>
-          </w:p>
-        </w:tc>
-        <w:tc>
-          <w:tcPr>
-            <w:tcW w:type="dxa" w:w="1872"/>
-          </w:tcPr>
-          <w:p>
-            <w:r/>
-            <w:r>
-              <w:rPr>
-                <w:b/>
-                <w:sz w:val="20"/>
-              </w:rPr>
-              <w:t>4 luồng</w:t>
-            </w:r>
-          </w:p>
-        </w:tc>
-        <w:tc>
-          <w:tcPr>
-            <w:tcW w:type="dxa" w:w="1872"/>
-          </w:tcPr>
-          <w:p>
-            <w:r/>
-            <w:r>
-              <w:rPr>
-                <w:b/>
-                <w:sz w:val="20"/>
-              </w:rPr>
-              <w:t>Điện năng, 4 luồng</w:t>
+              <w:t>Giá trị</w:t>
             </w:r>
           </w:p>
         </w:tc>
@@ -1331,7 +1299,7 @@
       <w:tr>
         <w:tc>
           <w:tcPr>
-            <w:tcW w:type="dxa" w:w="1872"/>
+            <w:tcW w:type="dxa" w:w="4680"/>
           </w:tcPr>
           <w:p>
             <w:r/>
@@ -1340,13 +1308,13 @@
                 <w:b w:val="0"/>
                 <w:sz w:val="20"/>
               </w:rPr>
-              <w:t>.pt</w:t>
-            </w:r>
-          </w:p>
-        </w:tc>
-        <w:tc>
-          <w:tcPr>
-            <w:tcW w:type="dxa" w:w="1872"/>
+              <w:t>Suy luận run(), trung vị 50 ảnh</w:t>
+            </w:r>
+          </w:p>
+        </w:tc>
+        <w:tc>
+          <w:tcPr>
+            <w:tcW w:type="dxa" w:w="4680"/>
           </w:tcPr>
           <w:p>
             <w:r/>
@@ -1355,52 +1323,7 @@
                 <w:b w:val="0"/>
                 <w:sz w:val="20"/>
               </w:rPr>
-              <w:t>ResNet18</w:t>
-            </w:r>
-          </w:p>
-        </w:tc>
-        <w:tc>
-          <w:tcPr>
-            <w:tcW w:type="dxa" w:w="1872"/>
-          </w:tcPr>
-          <w:p>
-            <w:r/>
-            <w:r>
-              <w:rPr>
-                <w:b w:val="0"/>
-                <w:sz w:val="20"/>
-              </w:rPr>
-              <w:t>813,9 ms</w:t>
-            </w:r>
-          </w:p>
-        </w:tc>
-        <w:tc>
-          <w:tcPr>
-            <w:tcW w:type="dxa" w:w="1872"/>
-          </w:tcPr>
-          <w:p>
-            <w:r/>
-            <w:r>
-              <w:rPr>
-                <w:b/>
-                <w:sz w:val="20"/>
-              </w:rPr>
-              <w:t>495,3 ms</w:t>
-            </w:r>
-          </w:p>
-        </w:tc>
-        <w:tc>
-          <w:tcPr>
-            <w:tcW w:type="dxa" w:w="1872"/>
-          </w:tcPr>
-          <w:p>
-            <w:r/>
-            <w:r>
-              <w:rPr>
-                <w:b w:val="0"/>
-                <w:sz w:val="20"/>
-              </w:rPr>
-              <w:t>3,2 J</w:t>
+              <w:t>462,4 ms</w:t>
             </w:r>
           </w:p>
         </w:tc>
@@ -1408,7 +1331,7 @@
       <w:tr>
         <w:tc>
           <w:tcPr>
-            <w:tcW w:type="dxa" w:w="1872"/>
+            <w:tcW w:type="dxa" w:w="4680"/>
           </w:tcPr>
           <w:p>
             <w:r/>
@@ -1417,13 +1340,13 @@
                 <w:b w:val="0"/>
                 <w:sz w:val="20"/>
               </w:rPr>
-              <w:t>.onnx</w:t>
-            </w:r>
-          </w:p>
-        </w:tc>
-        <w:tc>
-          <w:tcPr>
-            <w:tcW w:type="dxa" w:w="1872"/>
+              <w:t>Suy luận run(), phân vị 90</w:t>
+            </w:r>
+          </w:p>
+        </w:tc>
+        <w:tc>
+          <w:tcPr>
+            <w:tcW w:type="dxa" w:w="4680"/>
           </w:tcPr>
           <w:p>
             <w:r/>
@@ -1432,52 +1355,7 @@
                 <w:b w:val="0"/>
                 <w:sz w:val="20"/>
               </w:rPr>
-              <w:t>ResNet18</w:t>
-            </w:r>
-          </w:p>
-        </w:tc>
-        <w:tc>
-          <w:tcPr>
-            <w:tcW w:type="dxa" w:w="1872"/>
-          </w:tcPr>
-          <w:p>
-            <w:r/>
-            <w:r>
-              <w:rPr>
-                <w:b w:val="0"/>
-                <w:sz w:val="20"/>
-              </w:rPr>
-              <w:t>1.067,4 ms</w:t>
-            </w:r>
-          </w:p>
-        </w:tc>
-        <w:tc>
-          <w:tcPr>
-            <w:tcW w:type="dxa" w:w="1872"/>
-          </w:tcPr>
-          <w:p>
-            <w:r/>
-            <w:r>
-              <w:rPr>
-                <w:b w:val="0"/>
-                <w:sz w:val="20"/>
-              </w:rPr>
-              <w:t>535,0 ms</w:t>
-            </w:r>
-          </w:p>
-        </w:tc>
-        <w:tc>
-          <w:tcPr>
-            <w:tcW w:type="dxa" w:w="1872"/>
-          </w:tcPr>
-          <w:p>
-            <w:r/>
-            <w:r>
-              <w:rPr>
-                <w:b w:val="0"/>
-                <w:sz w:val="20"/>
-              </w:rPr>
-              <w:t>3,7 J</w:t>
+              <w:t>488,0 ms</w:t>
             </w:r>
           </w:p>
         </w:tc>
@@ -1485,7 +1363,7 @@
       <w:tr>
         <w:tc>
           <w:tcPr>
-            <w:tcW w:type="dxa" w:w="1872"/>
+            <w:tcW w:type="dxa" w:w="4680"/>
           </w:tcPr>
           <w:p>
             <w:r/>
@@ -1494,13 +1372,13 @@
                 <w:b w:val="0"/>
                 <w:sz w:val="20"/>
               </w:rPr>
-              <w:t>.onnx</w:t>
-            </w:r>
-          </w:p>
-        </w:tc>
-        <w:tc>
-          <w:tcPr>
-            <w:tcW w:type="dxa" w:w="1872"/>
+              <w:t>Qua API, đầu-cuối, trung vị</w:t>
+            </w:r>
+          </w:p>
+        </w:tc>
+        <w:tc>
+          <w:tcPr>
+            <w:tcW w:type="dxa" w:w="4680"/>
           </w:tcPr>
           <w:p>
             <w:r/>
@@ -1509,13 +1387,15 @@
                 <w:b w:val="0"/>
                 <w:sz w:val="20"/>
               </w:rPr>
-              <w:t>MobileNetV3-Small</w:t>
-            </w:r>
-          </w:p>
-        </w:tc>
-        <w:tc>
-          <w:tcPr>
-            <w:tcW w:type="dxa" w:w="1872"/>
+              <w:t>464,0 ms</w:t>
+            </w:r>
+          </w:p>
+        </w:tc>
+      </w:tr>
+      <w:tr>
+        <w:tc>
+          <w:tcPr>
+            <w:tcW w:type="dxa" w:w="4680"/>
           </w:tcPr>
           <w:p>
             <w:r/>
@@ -1524,13 +1404,13 @@
                 <w:b w:val="0"/>
                 <w:sz w:val="20"/>
               </w:rPr>
-              <w:t>1.082,4 ms</w:t>
-            </w:r>
-          </w:p>
-        </w:tc>
-        <w:tc>
-          <w:tcPr>
-            <w:tcW w:type="dxa" w:w="1872"/>
+              <w:t>Qua API, đầu-cuối, phân vị 90</w:t>
+            </w:r>
+          </w:p>
+        </w:tc>
+        <w:tc>
+          <w:tcPr>
+            <w:tcW w:type="dxa" w:w="4680"/>
           </w:tcPr>
           <w:p>
             <w:r/>
@@ -1539,13 +1419,15 @@
                 <w:b w:val="0"/>
                 <w:sz w:val="20"/>
               </w:rPr>
-              <w:t>550,4 ms</w:t>
-            </w:r>
-          </w:p>
-        </w:tc>
-        <w:tc>
-          <w:tcPr>
-            <w:tcW w:type="dxa" w:w="1872"/>
+              <w:t>494,1 ms</w:t>
+            </w:r>
+          </w:p>
+        </w:tc>
+      </w:tr>
+      <w:tr>
+        <w:tc>
+          <w:tcPr>
+            <w:tcW w:type="dxa" w:w="4680"/>
           </w:tcPr>
           <w:p>
             <w:r/>
@@ -1554,7 +1436,118 @@
                 <w:b w:val="0"/>
                 <w:sz w:val="20"/>
               </w:rPr>
-              <w:t>3,7 J</w:t>
+              <w:t>Qua API, phần ngoài suy luận, trung vị</w:t>
+            </w:r>
+          </w:p>
+        </w:tc>
+        <w:tc>
+          <w:tcPr>
+            <w:tcW w:type="dxa" w:w="4680"/>
+          </w:tcPr>
+          <w:p>
+            <w:r/>
+            <w:r>
+              <w:rPr>
+                <w:b w:val="0"/>
+                <w:sz w:val="20"/>
+              </w:rPr>
+              <w:t>16,5 ms</w:t>
+            </w:r>
+          </w:p>
+        </w:tc>
+      </w:tr>
+      <w:tr>
+        <w:tc>
+          <w:tcPr>
+            <w:tcW w:type="dxa" w:w="4680"/>
+          </w:tcPr>
+          <w:p>
+            <w:r/>
+            <w:r>
+              <w:rPr>
+                <w:b w:val="0"/>
+                <w:sz w:val="20"/>
+              </w:rPr>
+              <w:t>Lượt đầu tiên sau khi khởi động backend (nạp model)</w:t>
+            </w:r>
+          </w:p>
+        </w:tc>
+        <w:tc>
+          <w:tcPr>
+            <w:tcW w:type="dxa" w:w="4680"/>
+          </w:tcPr>
+          <w:p>
+            <w:r/>
+            <w:r>
+              <w:rPr>
+                <w:b w:val="0"/>
+                <w:sz w:val="20"/>
+              </w:rPr>
+              <w:t>4,8 giây</w:t>
+            </w:r>
+          </w:p>
+        </w:tc>
+      </w:tr>
+      <w:tr>
+        <w:tc>
+          <w:tcPr>
+            <w:tcW w:type="dxa" w:w="4680"/>
+          </w:tcPr>
+          <w:p>
+            <w:r/>
+            <w:r>
+              <w:rPr>
+                <w:b w:val="0"/>
+                <w:sz w:val="20"/>
+              </w:rPr>
+              <w:t>Điện năng mỗi lượt xe</w:t>
+            </w:r>
+          </w:p>
+        </w:tc>
+        <w:tc>
+          <w:tcPr>
+            <w:tcW w:type="dxa" w:w="4680"/>
+          </w:tcPr>
+          <w:p>
+            <w:r/>
+            <w:r>
+              <w:rPr>
+                <w:b w:val="0"/>
+                <w:sz w:val="20"/>
+              </w:rPr>
+              <w:t>3,14 J</w:t>
+            </w:r>
+          </w:p>
+        </w:tc>
+      </w:tr>
+      <w:tr>
+        <w:tc>
+          <w:tcPr>
+            <w:tcW w:type="dxa" w:w="4680"/>
+          </w:tcPr>
+          <w:p>
+            <w:r/>
+            <w:r>
+              <w:rPr>
+                <w:b w:val="0"/>
+                <w:sz w:val="20"/>
+              </w:rPr>
+              <w:t>Kết quả nhận dạng trùng máy dev</w:t>
+            </w:r>
+          </w:p>
+        </w:tc>
+        <w:tc>
+          <w:tcPr>
+            <w:tcW w:type="dxa" w:w="4680"/>
+          </w:tcPr>
+          <w:p>
+            <w:r/>
+            <w:r>
+              <w:rPr>
+                <w:b w:val="0"/>
+                <w:sz w:val="20"/>
+              </w:rPr>
+              <w:t>50/50 ảnh</w:t>
             </w:r>
           </w:p>
         </w:tc>
@@ -1569,7 +1562,7 @@
         <w:rPr>
           <w:b w:val="0"/>
         </w:rPr>
-        <w:t>Riêng bước kiểu dáng: ResNet18 mất 132,3 ms (1 luồng) và 75,8 ms (4 luồng), MobileNetV3-Small mất 16,0 ms và 27,8 ms. Bảng trên không thấy khác biệt vì ảnh đo là xe máy, pipeline chỉ chạy bước kiểu dáng với ô tô.</w:t>
+        <w:t>Hai dòng suy luận và đầu-cuối đo ở hai lần chạy khác nhau nên không trừ trực tiếp cho nhau; phần ngoài suy luận lấy từ cùng request trong lần đo qua API.</w:t>
       </w:r>
     </w:p>
     <w:p>
@@ -1589,7 +1582,7 @@
         <w:rPr>
           <w:b w:val="0"/>
         </w:rPr>
-        <w:t>Đạt mốc đề cương: 495,3 ms mỗi lượt, nhanh hơn mốc 2 giây khoảng 4 lần. Lúc nghỉ Pi tiêu khoảng 1,5 W.</w:t>
+        <w:t>Đạt mốc đề cương: đầu-cuối 464 ms mỗi lượt (phân vị 90 là 494 ms), nhanh hơn mốc 2 giây khoảng 4 lần. Lượt đầu sau khi khởi động backend mất 4,8 giây vì nạp model; nạp sẵn model lúc khởi động sẽ tránh được độ trễ này.</w:t>
       </w:r>
     </w:p>
     <w:p>
@@ -1600,7 +1593,29 @@
         <w:rPr>
           <w:b w:val="0"/>
         </w:rPr>
-        <w:t>Cấu hình triển khai trên Pi: 4 luồng, định vị xe bằng .pt (bản .onnx chậm hơn 8% đến 31%), kiểu dáng bằng MobileNetV3-Small ONNX. Bản ONNX khớp .pt trên 987/987 ảnh test, accuracy giữ nguyên 0,9007.</w:t>
+        <w:t>MobileNetV3-Small cho bước kiểu dáng: với ảnh ô tô, toàn pipeline giảm từ 537,4 ms (ResNet18) xuống 480,3 ms; accuracy không đổi (0,9007, bản ONNX khớp .pt trên 987/987 ảnh test).</w:t>
+      </w:r>
+    </w:p>
+    <w:p>
+      <w:pPr>
+        <w:pStyle w:val="ListBullet"/>
+      </w:pPr>
+      <w:r>
+        <w:rPr>
+          <w:b w:val="0"/>
+        </w:rPr>
+        <w:t>Kết quả nhận dạng trên Pi trùng máy dev ở cả 50 ảnh, nên model chạy trên ARM không lệch kết quả.</w:t>
+      </w:r>
+    </w:p>
+    <w:p>
+      <w:pPr>
+        <w:pStyle w:val="ListBullet"/>
+      </w:pPr>
+      <w:r>
+        <w:rPr>
+          <w:b w:val="0"/>
+        </w:rPr>
+        <w:t>4 luồng và .pt cho bước định vị xe chọn theo lần đo trước trên ảnh mẫu: 4 luồng nhanh nhất, bản .onnx chậm hơn .pt (535,0 so với 495,3 ms ở 4 luồng).</w:t>
       </w:r>
     </w:p>
     <w:p>
@@ -1781,7 +1796,7 @@
         <w:rPr>
           <w:b w:val="0"/>
         </w:rPr>
-        <w:t>Đo trên Raspberry Pi 5 thật: toàn pipeline 495,3 ms mỗi lượt ở 4 luồng, nhanh hơn mốc 2 giây của đề cương khoảng 4 lần; điện năng khoảng 3,2 J mỗi lượt xe, đo bằng ADC của chip quản lý nguồn. Xuất MobileNetV3-Small ONNX cho bước kiểu dáng (khớp .pt 987/987 ảnh), bước này nhanh hơn 8 lần trên Pi.</w:t>
+        <w:t>Đo trên Raspberry Pi 5 thật với 50 ảnh camera cổng: đầu-cuối qua API 464 ms mỗi lượt (phân vị 90 là 494 ms), nhanh hơn mốc 2 giây của đề cương khoảng 4 lần; điện năng khoảng 3,1 J mỗi lượt xe; kết quả nhận dạng trùng máy dev ở cả 50 ảnh. Xuất MobileNetV3-Small ONNX cho bước kiểu dáng (khớp .pt 987/987 ảnh), ảnh ô tô nhanh hơn 57 ms mỗi lượt.</w:t>
       </w:r>
     </w:p>
     <w:sectPr>

</xml_diff>

<commit_message>
fix(ml): đo lại Pi 5 có chờ SoC nguội giữa các cấu hình
Thêm bước chờ SoC nguội vào run_pi_anh_that.sh và run_pi_do_tre_api.sh rồi
đo lại trên Pi 5:
- API: đầu-cuối 463,4 ms, p90 487,9 ms, ngoài suy luận 17,5 ms, 0/76 mẫu có
  cờ get_throttled.
- 50 ảnh: không mẫu nào sụt áp hay hạ xung, xung giữ 2400 MHz; bit 3 (ngưỡng
  nhiệt mềm) bật ở 3/114 và 13/118 mẫu.
- So từng ảnh: ResNet18 chậm hơn MobileNetV3-Small trung vị 51,3 ms trên 18
  ảnh có qua bước kiểu dáng.

summarize_pi_anh_that.py tách cờ hạ xung với cờ nhiệt mềm, thêm xung thấp
nhất và nhiệt độ 5 phút trước mỗi cấu hình. Cập nhật báo cáo tuần 7, chương 5
và notebook theo số mới.
</commit_message>
<xml_diff>
--- a/docs/report/chapters/w7-onnx.docx
+++ b/docs/report/chapters/w7-onnx.docx
@@ -1178,80 +1178,16 @@
         <w:rPr>
           <w:b w:val="0"/>
         </w:rPr>
-        <w:t>Đo trên Raspberry Pi 5 16GB (Debian 13, thẻ microSD, nguồn 3A) với đúng cấu hình backend đang chạy: 4 luồng, định vị xe bằng .pt, kiểu dáng bằng MobileNetV3-Small ONNX. Log gốc ở src/ml/experiments/pi5_anh_that/ và src/ml/experiments/pi5_do_tre_api/.</w:t>
+        <w:t>Máy đo là Raspberry Pi 5 Model B 16GB, chạy Debian 13 trên thẻ microSD, nguồn khai báo tối đa 3000 mA, có quạt tản nhiệt (thông tin ghi trong src/ml/experiments/pi5/may_do.txt). Cấu hình model giống backend đang chạy trên Pi: 4 luồng, định vị xe bằng yolov8n.pt, kiểu dáng bằng MobileNetV3-Small ONNX.</w:t>
       </w:r>
     </w:p>
     <w:p>
       <w:pPr/>
       <w:r>
         <w:rPr>
-          <w:b/>
-        </w:rPr>
-        <w:t>Cách đo.</w:t>
-      </w:r>
-    </w:p>
-    <w:p>
-      <w:pPr>
-        <w:pStyle w:val="ListBullet"/>
-      </w:pPr>
-      <w:r>
-        <w:rPr>
           <w:b w:val="0"/>
         </w:rPr>
-        <w:t>Ảnh: 50 ảnh camera cổng thật (25 ô tô, 25 xe máy), lấy ngẫu nhiên với seed cố định từ tập val của A1. Danh sách ở src/ml/data/anh_cong_benchmark.txt.</w:t>
-      </w:r>
-    </w:p>
-    <w:p>
-      <w:pPr>
-        <w:pStyle w:val="ListBullet"/>
-      </w:pPr>
-      <w:r>
-        <w:rPr>
-          <w:b w:val="0"/>
-        </w:rPr>
-        <w:t>Thời gian suy luận: benchmark_anh_that.py gọi OnnxAlprPipeline.run() 5 vòng mỗi ảnh bằng đồng hồ time.perf_counter(), lấy trung vị từng ảnh rồi báo trung vị và phân vị 90 trên 50 ảnh. Không tính đọc ảnh từ đĩa.</w:t>
-      </w:r>
-    </w:p>
-    <w:p>
-      <w:pPr>
-        <w:pStyle w:val="ListBullet"/>
-      </w:pPr>
-      <w:r>
-        <w:rPr>
-          <w:b w:val="0"/>
-        </w:rPr>
-        <w:t>Độ trễ đầu-cuối: do_tre_api.py gọi POST /captures/infer của backend thật trên Pi, 3 vòng mỗi ảnh, tính từ lúc gửi tới lúc nhận phản hồi. Phần ngoài suy luận tính trên cùng một request: thời gian phía client trừ thời gian suy luận backend tự đo. Chưa gồm độ trễ mạng LAN.</w:t>
-      </w:r>
-    </w:p>
-    <w:p>
-      <w:pPr>
-        <w:pStyle w:val="ListBullet"/>
-      </w:pPr>
-      <w:r>
-        <w:rPr>
-          <w:b w:val="0"/>
-        </w:rPr>
-        <w:t>Điện năng: chip quản lý nguồn của Pi 5 (PMIC) có ADC đo dòng và áp từng nhánh nguồn, đọc bằng vcgencmd pmic_read_adc mỗi giây, P = Σ V_k × I_k. Trong khoảng đo chỉ có vòng gọi run(), nên E mỗi lượt = P trung bình × thời gian đo / số lượt. Số này là cận dưới của điện năng ở ổ cắm vì không tính củ sạc và thiết bị USB.</w:t>
-      </w:r>
-    </w:p>
-    <w:p>
-      <w:pPr>
-        <w:pStyle w:val="ListBullet"/>
-      </w:pPr>
-      <w:r>
-        <w:rPr>
-          <w:b w:val="0"/>
-        </w:rPr>
-        <w:t>Kiểm tra kết quả: so chuỗi biển, loại xe và kiểu dáng của từng ảnh trên Pi với cùng cấu hình chạy trên máy dev.</w:t>
-      </w:r>
-    </w:p>
-    <w:p>
-      <w:pPr/>
-      <w:r>
-        <w:rPr>
-          <w:b/>
-        </w:rPr>
-        <w:t>Kết quả.</w:t>
+        <w:t>Nhóm đo hai lần riêng, dùng chung một bộ ảnh:</w:t>
       </w:r>
     </w:p>
     <w:tbl>
@@ -1261,13 +1197,15 @@
         <w:tblLook w:firstColumn="1" w:firstRow="1" w:lastColumn="0" w:lastRow="0" w:noHBand="0" w:noVBand="1" w:val="04A0"/>
       </w:tblPr>
       <w:tblGrid>
-        <w:gridCol w:w="4680"/>
-        <w:gridCol w:w="4680"/>
+        <w:gridCol w:w="2340"/>
+        <w:gridCol w:w="2340"/>
+        <w:gridCol w:w="2340"/>
+        <w:gridCol w:w="2340"/>
       </w:tblGrid>
       <w:tr>
         <w:tc>
           <w:tcPr>
-            <w:tcW w:type="dxa" w:w="4680"/>
+            <w:tcW w:type="dxa" w:w="2340"/>
           </w:tcPr>
           <w:p>
             <w:r/>
@@ -1276,13 +1214,13 @@
                 <w:b/>
                 <w:sz w:val="20"/>
               </w:rPr>
-              <w:t>Chỉ số</w:t>
-            </w:r>
-          </w:p>
-        </w:tc>
-        <w:tc>
-          <w:tcPr>
-            <w:tcW w:type="dxa" w:w="4680"/>
+              <w:t>Lần đo</w:t>
+            </w:r>
+          </w:p>
+        </w:tc>
+        <w:tc>
+          <w:tcPr>
+            <w:tcW w:type="dxa" w:w="2340"/>
           </w:tcPr>
           <w:p>
             <w:r/>
@@ -1291,7 +1229,37 @@
                 <w:b/>
                 <w:sz w:val="20"/>
               </w:rPr>
-              <w:t>Giá trị</w:t>
+              <w:t>Mục đích</w:t>
+            </w:r>
+          </w:p>
+        </w:tc>
+        <w:tc>
+          <w:tcPr>
+            <w:tcW w:type="dxa" w:w="2340"/>
+          </w:tcPr>
+          <w:p>
+            <w:r/>
+            <w:r>
+              <w:rPr>
+                <w:b/>
+                <w:sz w:val="20"/>
+              </w:rPr>
+              <w:t>Script</w:t>
+            </w:r>
+          </w:p>
+        </w:tc>
+        <w:tc>
+          <w:tcPr>
+            <w:tcW w:type="dxa" w:w="2340"/>
+          </w:tcPr>
+          <w:p>
+            <w:r/>
+            <w:r>
+              <w:rPr>
+                <w:b/>
+                <w:sz w:val="20"/>
+              </w:rPr>
+              <w:t>Log gốc</w:t>
             </w:r>
           </w:p>
         </w:tc>
@@ -1299,31 +1267,61 @@
       <w:tr>
         <w:tc>
           <w:tcPr>
-            <w:tcW w:type="dxa" w:w="4680"/>
-          </w:tcPr>
-          <w:p>
-            <w:r/>
-            <w:r>
-              <w:rPr>
-                <w:b w:val="0"/>
-                <w:sz w:val="20"/>
-              </w:rPr>
-              <w:t>Suy luận run(), trung vị 50 ảnh</w:t>
-            </w:r>
-          </w:p>
-        </w:tc>
-        <w:tc>
-          <w:tcPr>
-            <w:tcW w:type="dxa" w:w="4680"/>
-          </w:tcPr>
-          <w:p>
-            <w:r/>
-            <w:r>
-              <w:rPr>
-                <w:b w:val="0"/>
-                <w:sz w:val="20"/>
-              </w:rPr>
-              <w:t>462,4 ms</w:t>
+            <w:tcW w:type="dxa" w:w="2340"/>
+          </w:tcPr>
+          <w:p>
+            <w:r/>
+            <w:r>
+              <w:rPr>
+                <w:b w:val="0"/>
+                <w:sz w:val="20"/>
+              </w:rPr>
+              <w:t>A: gọi run() trực tiếp</w:t>
+            </w:r>
+          </w:p>
+        </w:tc>
+        <w:tc>
+          <w:tcPr>
+            <w:tcW w:type="dxa" w:w="2340"/>
+          </w:tcPr>
+          <w:p>
+            <w:r/>
+            <w:r>
+              <w:rPr>
+                <w:b w:val="0"/>
+                <w:sz w:val="20"/>
+              </w:rPr>
+              <w:t>So hai model kiểu dáng, đo điện năng</w:t>
+            </w:r>
+          </w:p>
+        </w:tc>
+        <w:tc>
+          <w:tcPr>
+            <w:tcW w:type="dxa" w:w="2340"/>
+          </w:tcPr>
+          <w:p>
+            <w:r/>
+            <w:r>
+              <w:rPr>
+                <w:b w:val="0"/>
+                <w:sz w:val="20"/>
+              </w:rPr>
+              <w:t>run_pi_anh_that.sh, benchmark_anh_that.py, summarize_pi_anh_that.py</w:t>
+            </w:r>
+          </w:p>
+        </w:tc>
+        <w:tc>
+          <w:tcPr>
+            <w:tcW w:type="dxa" w:w="2340"/>
+          </w:tcPr>
+          <w:p>
+            <w:r/>
+            <w:r>
+              <w:rPr>
+                <w:b w:val="0"/>
+                <w:sz w:val="20"/>
+              </w:rPr>
+              <w:t>src/ml/experiments/pi5_anh_that/</w:t>
             </w:r>
           </w:p>
         </w:tc>
@@ -1331,31 +1329,231 @@
       <w:tr>
         <w:tc>
           <w:tcPr>
-            <w:tcW w:type="dxa" w:w="4680"/>
-          </w:tcPr>
-          <w:p>
-            <w:r/>
-            <w:r>
-              <w:rPr>
-                <w:b w:val="0"/>
-                <w:sz w:val="20"/>
-              </w:rPr>
-              <w:t>Suy luận run(), phân vị 90</w:t>
-            </w:r>
-          </w:p>
-        </w:tc>
-        <w:tc>
-          <w:tcPr>
-            <w:tcW w:type="dxa" w:w="4680"/>
-          </w:tcPr>
-          <w:p>
-            <w:r/>
-            <w:r>
-              <w:rPr>
-                <w:b w:val="0"/>
-                <w:sz w:val="20"/>
-              </w:rPr>
-              <w:t>488,0 ms</w:t>
+            <w:tcW w:type="dxa" w:w="2340"/>
+          </w:tcPr>
+          <w:p>
+            <w:r/>
+            <w:r>
+              <w:rPr>
+                <w:b w:val="0"/>
+                <w:sz w:val="20"/>
+              </w:rPr>
+              <w:t>B: gọi API của backend</w:t>
+            </w:r>
+          </w:p>
+        </w:tc>
+        <w:tc>
+          <w:tcPr>
+            <w:tcW w:type="dxa" w:w="2340"/>
+          </w:tcPr>
+          <w:p>
+            <w:r/>
+            <w:r>
+              <w:rPr>
+                <w:b w:val="0"/>
+                <w:sz w:val="20"/>
+              </w:rPr>
+              <w:t>Độ trễ đầu-cuối</w:t>
+            </w:r>
+          </w:p>
+        </w:tc>
+        <w:tc>
+          <w:tcPr>
+            <w:tcW w:type="dxa" w:w="2340"/>
+          </w:tcPr>
+          <w:p>
+            <w:r/>
+            <w:r>
+              <w:rPr>
+                <w:b w:val="0"/>
+                <w:sz w:val="20"/>
+              </w:rPr>
+              <w:t>run_pi_do_tre_api.sh, do_tre_api.py</w:t>
+            </w:r>
+          </w:p>
+        </w:tc>
+        <w:tc>
+          <w:tcPr>
+            <w:tcW w:type="dxa" w:w="2340"/>
+          </w:tcPr>
+          <w:p>
+            <w:r/>
+            <w:r>
+              <w:rPr>
+                <w:b w:val="0"/>
+                <w:sz w:val="20"/>
+              </w:rPr>
+              <w:t>src/ml/experiments/pi5_do_tre_api/</w:t>
+            </w:r>
+          </w:p>
+        </w:tc>
+      </w:tr>
+    </w:tbl>
+    <w:p>
+      <w:pPr/>
+    </w:p>
+    <w:p>
+      <w:pPr/>
+      <w:r>
+        <w:rPr>
+          <w:b w:val="0"/>
+        </w:rPr>
+        <w:t>Các bảng dưới đây tính lại được từ log bằng notebook src/ml/notebooks/benchmark-raspberry-pi5.ipynb.</w:t>
+      </w:r>
+    </w:p>
+    <w:p>
+      <w:pPr/>
+      <w:r>
+        <w:rPr>
+          <w:b/>
+        </w:rPr>
+        <w:t>Cách đo.</w:t>
+      </w:r>
+    </w:p>
+    <w:p>
+      <w:pPr>
+        <w:pStyle w:val="ListBullet"/>
+      </w:pPr>
+      <w:r>
+        <w:rPr>
+          <w:b w:val="0"/>
+        </w:rPr>
+        <w:t>Ảnh: 50 ảnh camera cổng thật (25 ô tô, 25 xe máy), chọn ngẫu nhiên với seed 2026 từ tập val của A1, danh sách ở src/ml/data/anh_cong_benchmark.txt.</w:t>
+      </w:r>
+    </w:p>
+    <w:p>
+      <w:pPr>
+        <w:pStyle w:val="ListBullet"/>
+      </w:pPr>
+      <w:r>
+        <w:rPr>
+          <w:b w:val="0"/>
+        </w:rPr>
+        <w:t>Lần A: nạp hết ảnh vào bộ nhớ, làm nóng 3 ảnh, rồi gọi OnnxAlprPipeline.run() 5 vòng trên mỗi ảnh, bấm giờ bằng time.perf_counter(). Mỗi ảnh lấy trung vị 5 vòng, sau đó tính trung vị và phân vị 90 trên 50 ảnh. Không tính thời gian đọc ảnh.</w:t>
+      </w:r>
+    </w:p>
+    <w:p>
+      <w:pPr>
+        <w:pStyle w:val="ListBullet"/>
+      </w:pPr>
+      <w:r>
+        <w:rPr>
+          <w:b w:val="0"/>
+        </w:rPr>
+        <w:t>Lần B: chạy một backend riêng ở cổng 8001 với cùng biến model như service thật, trỏ vào bản sao cơ sở dữ liệu; backend chính tạm dừng để không tranh CPU. do_tre_api.py gọi POST /captures/infer 3 vòng trên mỗi ảnh, bấm giờ từ lúc gửi tới lúc nhận phản hồi. Phản hồi có trường timings_ms.tong là tổng thời gian các bước pipeline có bấm giờ (đổi màu, phát hiện biển, màu biển, OCR, định vị xe, loại xe, kiểu dáng). Phần ngoài suy luận tính trên cùng một request, t_ngoài = t_client - timings_ms.tong, gồm HTTP, giải mã ảnh, lưu ảnh, ghi cơ sở dữ liệu và đoạn code không bấm giờ giữa các bước. Client và backend chạy cùng máy nên chưa gồm độ trễ mạng LAN.</w:t>
+      </w:r>
+    </w:p>
+    <w:p>
+      <w:pPr>
+        <w:pStyle w:val="ListBullet"/>
+      </w:pPr>
+      <w:r>
+        <w:rPr>
+          <w:b w:val="0"/>
+        </w:rPr>
+        <w:t>Điện năng: chip quản lý nguồn (PMIC) của Pi 5 có ADC đo dòng và áp trên từng nhánh nguồn. pi_power_monitor.py đọc vcgencmd pmic_read_adc mỗi giây và tính P = Σ V_k × I_k, chỉ cộng những nhánh có cả dòng và áp. Mốc thời gian của mỗi cấu hình do benchmark_anh_that.py ghi và chỉ bao vòng gọi run(), nên E mỗi lượt = P trung bình trong mốc × độ dài mốc / số lượt. Con số này là cận dưới của điện năng lấy từ ổ cắm vì không tính hao phí củ sạc và thiết bị USB.</w:t>
+      </w:r>
+    </w:p>
+    <w:p>
+      <w:pPr>
+        <w:pStyle w:val="ListBullet"/>
+      </w:pPr>
+      <w:r>
+        <w:rPr>
+          <w:b w:val="0"/>
+        </w:rPr>
+        <w:t>Nhiệt độ và hạ xung: cùng script ghi nhiệt độ SoC, xung CPU và vcgencmd get_throttled mỗi giây. Bit 0 đến 3 của get_throttled lần lượt báo sụt áp, đang giới hạn xung, đang hạ xung và chạm ngưỡng nhiệt mềm. Trước mỗi cấu hình của lần A và trước lần B, script chờ tới khi phần nguyên nhiệt độ SoC không quá 58°C, tối đa 5 phút.</w:t>
+      </w:r>
+    </w:p>
+    <w:p>
+      <w:pPr>
+        <w:pStyle w:val="ListBullet"/>
+      </w:pPr>
+      <w:r>
+        <w:rPr>
+          <w:b w:val="0"/>
+        </w:rPr>
+        <w:t>Kết quả nhận dạng: so chuỗi biển, loại xe và kiểu dáng từng ảnh của lần A với cùng cấu hình chạy trên máy dev (src/ml/experiments/anh_that_dev/).</w:t>
+      </w:r>
+    </w:p>
+    <w:p>
+      <w:pPr/>
+      <w:r>
+        <w:rPr>
+          <w:b/>
+        </w:rPr>
+        <w:t>Kết quả lần B: độ trễ đầu-cuối qua API.</w:t>
+      </w:r>
+      <w:r>
+        <w:rPr>
+          <w:b w:val="0"/>
+        </w:rPr>
+        <w:t xml:space="preserve"> 150 lượt (50 ảnh × 3 vòng), mỗi ảnh lấy trung vị 3 vòng. Nguồn: pi5_do_tre_api/do_tre_api.log.</w:t>
+      </w:r>
+    </w:p>
+    <w:tbl>
+      <w:tblPr>
+        <w:tblStyle w:val="TableGrid"/>
+        <w:tblW w:type="auto" w:w="0"/>
+        <w:tblLook w:firstColumn="1" w:firstRow="1" w:lastColumn="0" w:lastRow="0" w:noHBand="0" w:noVBand="1" w:val="04A0"/>
+      </w:tblPr>
+      <w:tblGrid>
+        <w:gridCol w:w="2340"/>
+        <w:gridCol w:w="2340"/>
+        <w:gridCol w:w="2340"/>
+        <w:gridCol w:w="2340"/>
+      </w:tblGrid>
+      <w:tr>
+        <w:tc>
+          <w:tcPr>
+            <w:tcW w:type="dxa" w:w="2340"/>
+          </w:tcPr>
+          <w:p>
+            <w:r/>
+          </w:p>
+        </w:tc>
+        <w:tc>
+          <w:tcPr>
+            <w:tcW w:type="dxa" w:w="2340"/>
+          </w:tcPr>
+          <w:p>
+            <w:r/>
+            <w:r>
+              <w:rPr>
+                <w:b/>
+                <w:sz w:val="20"/>
+              </w:rPr>
+              <w:t>Trung vị</w:t>
+            </w:r>
+          </w:p>
+        </w:tc>
+        <w:tc>
+          <w:tcPr>
+            <w:tcW w:type="dxa" w:w="2340"/>
+          </w:tcPr>
+          <w:p>
+            <w:r/>
+            <w:r>
+              <w:rPr>
+                <w:b/>
+                <w:sz w:val="20"/>
+              </w:rPr>
+              <w:t>Phân vị 90</w:t>
+            </w:r>
+          </w:p>
+        </w:tc>
+        <w:tc>
+          <w:tcPr>
+            <w:tcW w:type="dxa" w:w="2340"/>
+          </w:tcPr>
+          <w:p>
+            <w:r/>
+            <w:r>
+              <w:rPr>
+                <w:b/>
+                <w:sz w:val="20"/>
+              </w:rPr>
+              <w:t>Lớn nhất</w:t>
             </w:r>
           </w:p>
         </w:tc>
@@ -1363,31 +1561,61 @@
       <w:tr>
         <w:tc>
           <w:tcPr>
-            <w:tcW w:type="dxa" w:w="4680"/>
-          </w:tcPr>
-          <w:p>
-            <w:r/>
-            <w:r>
-              <w:rPr>
-                <w:b w:val="0"/>
-                <w:sz w:val="20"/>
-              </w:rPr>
-              <w:t>Qua API, đầu-cuối, trung vị</w:t>
-            </w:r>
-          </w:p>
-        </w:tc>
-        <w:tc>
-          <w:tcPr>
-            <w:tcW w:type="dxa" w:w="4680"/>
-          </w:tcPr>
-          <w:p>
-            <w:r/>
-            <w:r>
-              <w:rPr>
-                <w:b w:val="0"/>
-                <w:sz w:val="20"/>
-              </w:rPr>
-              <w:t>464,0 ms</w:t>
+            <w:tcW w:type="dxa" w:w="2340"/>
+          </w:tcPr>
+          <w:p>
+            <w:r/>
+            <w:r>
+              <w:rPr>
+                <w:b w:val="0"/>
+                <w:sz w:val="20"/>
+              </w:rPr>
+              <w:t>Đầu-cuối phía client</w:t>
+            </w:r>
+          </w:p>
+        </w:tc>
+        <w:tc>
+          <w:tcPr>
+            <w:tcW w:type="dxa" w:w="2340"/>
+          </w:tcPr>
+          <w:p>
+            <w:r/>
+            <w:r>
+              <w:rPr>
+                <w:b w:val="0"/>
+                <w:sz w:val="20"/>
+              </w:rPr>
+              <w:t>463,4 ms</w:t>
+            </w:r>
+          </w:p>
+        </w:tc>
+        <w:tc>
+          <w:tcPr>
+            <w:tcW w:type="dxa" w:w="2340"/>
+          </w:tcPr>
+          <w:p>
+            <w:r/>
+            <w:r>
+              <w:rPr>
+                <w:b w:val="0"/>
+                <w:sz w:val="20"/>
+              </w:rPr>
+              <w:t>487,9 ms</w:t>
+            </w:r>
+          </w:p>
+        </w:tc>
+        <w:tc>
+          <w:tcPr>
+            <w:tcW w:type="dxa" w:w="2340"/>
+          </w:tcPr>
+          <w:p>
+            <w:r/>
+            <w:r>
+              <w:rPr>
+                <w:b w:val="0"/>
+                <w:sz w:val="20"/>
+              </w:rPr>
+              <w:t>497,2 ms</w:t>
             </w:r>
           </w:p>
         </w:tc>
@@ -1395,31 +1623,61 @@
       <w:tr>
         <w:tc>
           <w:tcPr>
-            <w:tcW w:type="dxa" w:w="4680"/>
-          </w:tcPr>
-          <w:p>
-            <w:r/>
-            <w:r>
-              <w:rPr>
-                <w:b w:val="0"/>
-                <w:sz w:val="20"/>
-              </w:rPr>
-              <w:t>Qua API, đầu-cuối, phân vị 90</w:t>
-            </w:r>
-          </w:p>
-        </w:tc>
-        <w:tc>
-          <w:tcPr>
-            <w:tcW w:type="dxa" w:w="4680"/>
-          </w:tcPr>
-          <w:p>
-            <w:r/>
-            <w:r>
-              <w:rPr>
-                <w:b w:val="0"/>
-                <w:sz w:val="20"/>
-              </w:rPr>
-              <w:t>494,1 ms</w:t>
+            <w:tcW w:type="dxa" w:w="2340"/>
+          </w:tcPr>
+          <w:p>
+            <w:r/>
+            <w:r>
+              <w:rPr>
+                <w:b w:val="0"/>
+                <w:sz w:val="20"/>
+              </w:rPr>
+              <w:t>Các bước suy luận (timings_ms.tong)</w:t>
+            </w:r>
+          </w:p>
+        </w:tc>
+        <w:tc>
+          <w:tcPr>
+            <w:tcW w:type="dxa" w:w="2340"/>
+          </w:tcPr>
+          <w:p>
+            <w:r/>
+            <w:r>
+              <w:rPr>
+                <w:b w:val="0"/>
+                <w:sz w:val="20"/>
+              </w:rPr>
+              <w:t>445,8 ms</w:t>
+            </w:r>
+          </w:p>
+        </w:tc>
+        <w:tc>
+          <w:tcPr>
+            <w:tcW w:type="dxa" w:w="2340"/>
+          </w:tcPr>
+          <w:p>
+            <w:r/>
+            <w:r>
+              <w:rPr>
+                <w:b w:val="0"/>
+                <w:sz w:val="20"/>
+              </w:rPr>
+              <w:t>465,8 ms</w:t>
+            </w:r>
+          </w:p>
+        </w:tc>
+        <w:tc>
+          <w:tcPr>
+            <w:tcW w:type="dxa" w:w="2340"/>
+          </w:tcPr>
+          <w:p>
+            <w:r/>
+            <w:r>
+              <w:rPr>
+                <w:b w:val="0"/>
+                <w:sz w:val="20"/>
+              </w:rPr>
+              <w:t>475,3 ms</w:t>
             </w:r>
           </w:p>
         </w:tc>
@@ -1427,31 +1685,140 @@
       <w:tr>
         <w:tc>
           <w:tcPr>
-            <w:tcW w:type="dxa" w:w="4680"/>
-          </w:tcPr>
-          <w:p>
-            <w:r/>
-            <w:r>
-              <w:rPr>
-                <w:b w:val="0"/>
-                <w:sz w:val="20"/>
-              </w:rPr>
-              <w:t>Qua API, phần ngoài suy luận, trung vị</w:t>
-            </w:r>
-          </w:p>
-        </w:tc>
-        <w:tc>
-          <w:tcPr>
-            <w:tcW w:type="dxa" w:w="4680"/>
-          </w:tcPr>
-          <w:p>
-            <w:r/>
-            <w:r>
-              <w:rPr>
-                <w:b w:val="0"/>
-                <w:sz w:val="20"/>
-              </w:rPr>
-              <w:t>16,5 ms</w:t>
+            <w:tcW w:type="dxa" w:w="2340"/>
+          </w:tcPr>
+          <w:p>
+            <w:r/>
+            <w:r>
+              <w:rPr>
+                <w:b w:val="0"/>
+                <w:sz w:val="20"/>
+              </w:rPr>
+              <w:t>Ngoài suy luận, cùng request</w:t>
+            </w:r>
+          </w:p>
+        </w:tc>
+        <w:tc>
+          <w:tcPr>
+            <w:tcW w:type="dxa" w:w="2340"/>
+          </w:tcPr>
+          <w:p>
+            <w:r/>
+            <w:r>
+              <w:rPr>
+                <w:b w:val="0"/>
+                <w:sz w:val="20"/>
+              </w:rPr>
+              <w:t>17,5 ms</w:t>
+            </w:r>
+          </w:p>
+        </w:tc>
+        <w:tc>
+          <w:tcPr>
+            <w:tcW w:type="dxa" w:w="2340"/>
+          </w:tcPr>
+          <w:p>
+            <w:r/>
+            <w:r>
+              <w:rPr>
+                <w:b w:val="0"/>
+                <w:sz w:val="20"/>
+              </w:rPr>
+              <w:t>22,1 ms</w:t>
+            </w:r>
+          </w:p>
+        </w:tc>
+        <w:tc>
+          <w:tcPr>
+            <w:tcW w:type="dxa" w:w="2340"/>
+          </w:tcPr>
+          <w:p>
+            <w:r/>
+            <w:r>
+              <w:rPr>
+                <w:b w:val="0"/>
+                <w:sz w:val="20"/>
+              </w:rPr>
+              <w:t>29,1 ms</w:t>
+            </w:r>
+          </w:p>
+        </w:tc>
+      </w:tr>
+    </w:tbl>
+    <w:p>
+      <w:pPr/>
+    </w:p>
+    <w:p>
+      <w:pPr/>
+      <w:r>
+        <w:rPr>
+          <w:b w:val="0"/>
+        </w:rPr>
+        <w:t>Cả 150 lượt trả HTTP 200 và đều có loại xe, biển số. Lượt đầu tiên sau khi khởi động backend mất 4,8 giây vì backend nạp model ở lượt này (do_tre_api_luot_dau.txt). Lần đo kéo dài 77 giây, nhiệt độ SoC từ 57,3°C lên 77,7°C, không mẫu nào bật bit 0 đến 3.</w:t>
+      </w:r>
+    </w:p>
+    <w:p>
+      <w:pPr/>
+      <w:r>
+        <w:rPr>
+          <w:b/>
+        </w:rPr>
+        <w:t>Kết quả lần A: 50 ảnh, 5 vòng mỗi ảnh.</w:t>
+      </w:r>
+      <w:r>
+        <w:rPr>
+          <w:b w:val="0"/>
+        </w:rPr>
+        <w:t xml:space="preserve"> Nguồn: pi5_anh_that/tong_hop.csv, pt_mnv3.csv, pt_resnet.csv.</w:t>
+      </w:r>
+    </w:p>
+    <w:tbl>
+      <w:tblPr>
+        <w:tblStyle w:val="TableGrid"/>
+        <w:tblW w:type="auto" w:w="0"/>
+        <w:tblLook w:firstColumn="1" w:firstRow="1" w:lastColumn="0" w:lastRow="0" w:noHBand="0" w:noVBand="1" w:val="04A0"/>
+      </w:tblPr>
+      <w:tblGrid>
+        <w:gridCol w:w="3120"/>
+        <w:gridCol w:w="3120"/>
+        <w:gridCol w:w="3120"/>
+      </w:tblGrid>
+      <w:tr>
+        <w:tc>
+          <w:tcPr>
+            <w:tcW w:type="dxa" w:w="3120"/>
+          </w:tcPr>
+          <w:p>
+            <w:r/>
+          </w:p>
+        </w:tc>
+        <w:tc>
+          <w:tcPr>
+            <w:tcW w:type="dxa" w:w="3120"/>
+          </w:tcPr>
+          <w:p>
+            <w:r/>
+            <w:r>
+              <w:rPr>
+                <w:b/>
+                <w:sz w:val="20"/>
+              </w:rPr>
+              <w:t>MobileNetV3-Small</w:t>
+            </w:r>
+          </w:p>
+        </w:tc>
+        <w:tc>
+          <w:tcPr>
+            <w:tcW w:type="dxa" w:w="3120"/>
+          </w:tcPr>
+          <w:p>
+            <w:r/>
+            <w:r>
+              <w:rPr>
+                <w:b/>
+                <w:sz w:val="20"/>
+              </w:rPr>
+              <w:t>ResNet18</w:t>
             </w:r>
           </w:p>
         </w:tc>
@@ -1459,31 +1826,46 @@
       <w:tr>
         <w:tc>
           <w:tcPr>
-            <w:tcW w:type="dxa" w:w="4680"/>
-          </w:tcPr>
-          <w:p>
-            <w:r/>
-            <w:r>
-              <w:rPr>
-                <w:b w:val="0"/>
-                <w:sz w:val="20"/>
-              </w:rPr>
-              <w:t>Lượt đầu tiên sau khi khởi động backend (nạp model)</w:t>
-            </w:r>
-          </w:p>
-        </w:tc>
-        <w:tc>
-          <w:tcPr>
-            <w:tcW w:type="dxa" w:w="4680"/>
-          </w:tcPr>
-          <w:p>
-            <w:r/>
-            <w:r>
-              <w:rPr>
-                <w:b w:val="0"/>
-                <w:sz w:val="20"/>
-              </w:rPr>
-              <w:t>4,8 giây</w:t>
+            <w:tcW w:type="dxa" w:w="3120"/>
+          </w:tcPr>
+          <w:p>
+            <w:r/>
+            <w:r>
+              <w:rPr>
+                <w:b w:val="0"/>
+                <w:sz w:val="20"/>
+              </w:rPr>
+              <w:t>run(), trung vị 50 ảnh</w:t>
+            </w:r>
+          </w:p>
+        </w:tc>
+        <w:tc>
+          <w:tcPr>
+            <w:tcW w:type="dxa" w:w="3120"/>
+          </w:tcPr>
+          <w:p>
+            <w:r/>
+            <w:r>
+              <w:rPr>
+                <w:b w:val="0"/>
+                <w:sz w:val="20"/>
+              </w:rPr>
+              <w:t>464,4 ms</w:t>
+            </w:r>
+          </w:p>
+        </w:tc>
+        <w:tc>
+          <w:tcPr>
+            <w:tcW w:type="dxa" w:w="3120"/>
+          </w:tcPr>
+          <w:p>
+            <w:r/>
+            <w:r>
+              <w:rPr>
+                <w:b w:val="0"/>
+                <w:sz w:val="20"/>
+              </w:rPr>
+              <w:t>463,0 ms</w:t>
             </w:r>
           </w:p>
         </w:tc>
@@ -1491,31 +1873,46 @@
       <w:tr>
         <w:tc>
           <w:tcPr>
-            <w:tcW w:type="dxa" w:w="4680"/>
-          </w:tcPr>
-          <w:p>
-            <w:r/>
-            <w:r>
-              <w:rPr>
-                <w:b w:val="0"/>
-                <w:sz w:val="20"/>
-              </w:rPr>
-              <w:t>Điện năng mỗi lượt xe</w:t>
-            </w:r>
-          </w:p>
-        </w:tc>
-        <w:tc>
-          <w:tcPr>
-            <w:tcW w:type="dxa" w:w="4680"/>
-          </w:tcPr>
-          <w:p>
-            <w:r/>
-            <w:r>
-              <w:rPr>
-                <w:b w:val="0"/>
-                <w:sz w:val="20"/>
-              </w:rPr>
-              <w:t>3,14 J</w:t>
+            <w:tcW w:type="dxa" w:w="3120"/>
+          </w:tcPr>
+          <w:p>
+            <w:r/>
+            <w:r>
+              <w:rPr>
+                <w:b w:val="0"/>
+                <w:sz w:val="20"/>
+              </w:rPr>
+              <w:t>run(), phân vị 90</w:t>
+            </w:r>
+          </w:p>
+        </w:tc>
+        <w:tc>
+          <w:tcPr>
+            <w:tcW w:type="dxa" w:w="3120"/>
+          </w:tcPr>
+          <w:p>
+            <w:r/>
+            <w:r>
+              <w:rPr>
+                <w:b w:val="0"/>
+                <w:sz w:val="20"/>
+              </w:rPr>
+              <w:t>487,7 ms</w:t>
+            </w:r>
+          </w:p>
+        </w:tc>
+        <w:tc>
+          <w:tcPr>
+            <w:tcW w:type="dxa" w:w="3120"/>
+          </w:tcPr>
+          <w:p>
+            <w:r/>
+            <w:r>
+              <w:rPr>
+                <w:b w:val="0"/>
+                <w:sz w:val="20"/>
+              </w:rPr>
+              <w:t>539,1 ms</w:t>
             </w:r>
           </w:p>
         </w:tc>
@@ -1523,7 +1920,195 @@
       <w:tr>
         <w:tc>
           <w:tcPr>
-            <w:tcW w:type="dxa" w:w="4680"/>
+            <w:tcW w:type="dxa" w:w="3120"/>
+          </w:tcPr>
+          <w:p>
+            <w:r/>
+            <w:r>
+              <w:rPr>
+                <w:b w:val="0"/>
+                <w:sz w:val="20"/>
+              </w:rPr>
+              <w:t>Trung vị 18 ảnh có qua bước kiểu dáng</w:t>
+            </w:r>
+          </w:p>
+        </w:tc>
+        <w:tc>
+          <w:tcPr>
+            <w:tcW w:type="dxa" w:w="3120"/>
+          </w:tcPr>
+          <w:p>
+            <w:r/>
+            <w:r>
+              <w:rPr>
+                <w:b w:val="0"/>
+                <w:sz w:val="20"/>
+              </w:rPr>
+              <w:t>482,0 ms</w:t>
+            </w:r>
+          </w:p>
+        </w:tc>
+        <w:tc>
+          <w:tcPr>
+            <w:tcW w:type="dxa" w:w="3120"/>
+          </w:tcPr>
+          <w:p>
+            <w:r/>
+            <w:r>
+              <w:rPr>
+                <w:b w:val="0"/>
+                <w:sz w:val="20"/>
+              </w:rPr>
+              <w:t>536,4 ms</w:t>
+            </w:r>
+          </w:p>
+        </w:tc>
+      </w:tr>
+      <w:tr>
+        <w:tc>
+          <w:tcPr>
+            <w:tcW w:type="dxa" w:w="3120"/>
+          </w:tcPr>
+          <w:p>
+            <w:r/>
+            <w:r>
+              <w:rPr>
+                <w:b w:val="0"/>
+                <w:sz w:val="20"/>
+              </w:rPr>
+              <w:t>Trung vị 32 ảnh không qua bước kiểu dáng</w:t>
+            </w:r>
+          </w:p>
+        </w:tc>
+        <w:tc>
+          <w:tcPr>
+            <w:tcW w:type="dxa" w:w="3120"/>
+          </w:tcPr>
+          <w:p>
+            <w:r/>
+            <w:r>
+              <w:rPr>
+                <w:b w:val="0"/>
+                <w:sz w:val="20"/>
+              </w:rPr>
+              <w:t>461,4 ms</w:t>
+            </w:r>
+          </w:p>
+        </w:tc>
+        <w:tc>
+          <w:tcPr>
+            <w:tcW w:type="dxa" w:w="3120"/>
+          </w:tcPr>
+          <w:p>
+            <w:r/>
+            <w:r>
+              <w:rPr>
+                <w:b w:val="0"/>
+                <w:sz w:val="20"/>
+              </w:rPr>
+              <w:t>459,5 ms</w:t>
+            </w:r>
+          </w:p>
+        </w:tc>
+      </w:tr>
+      <w:tr>
+        <w:tc>
+          <w:tcPr>
+            <w:tcW w:type="dxa" w:w="3120"/>
+          </w:tcPr>
+          <w:p>
+            <w:r/>
+            <w:r>
+              <w:rPr>
+                <w:b w:val="0"/>
+                <w:sz w:val="20"/>
+              </w:rPr>
+              <w:t>Điện năng mỗi lượt</w:t>
+            </w:r>
+          </w:p>
+        </w:tc>
+        <w:tc>
+          <w:tcPr>
+            <w:tcW w:type="dxa" w:w="3120"/>
+          </w:tcPr>
+          <w:p>
+            <w:r/>
+            <w:r>
+              <w:rPr>
+                <w:b w:val="0"/>
+                <w:sz w:val="20"/>
+              </w:rPr>
+              <w:t>3,12 J</w:t>
+            </w:r>
+          </w:p>
+        </w:tc>
+        <w:tc>
+          <w:tcPr>
+            <w:tcW w:type="dxa" w:w="3120"/>
+          </w:tcPr>
+          <w:p>
+            <w:r/>
+            <w:r>
+              <w:rPr>
+                <w:b w:val="0"/>
+                <w:sz w:val="20"/>
+              </w:rPr>
+              <w:t>3,25 J</w:t>
+            </w:r>
+          </w:p>
+        </w:tc>
+      </w:tr>
+      <w:tr>
+        <w:tc>
+          <w:tcPr>
+            <w:tcW w:type="dxa" w:w="3120"/>
+          </w:tcPr>
+          <w:p>
+            <w:r/>
+            <w:r>
+              <w:rPr>
+                <w:b w:val="0"/>
+                <w:sz w:val="20"/>
+              </w:rPr>
+              <w:t>Điện năng tăng thêm so với lúc nghỉ (1,55 W)</w:t>
+            </w:r>
+          </w:p>
+        </w:tc>
+        <w:tc>
+          <w:tcPr>
+            <w:tcW w:type="dxa" w:w="3120"/>
+          </w:tcPr>
+          <w:p>
+            <w:r/>
+            <w:r>
+              <w:rPr>
+                <w:b w:val="0"/>
+                <w:sz w:val="20"/>
+              </w:rPr>
+              <w:t>2,39 J</w:t>
+            </w:r>
+          </w:p>
+        </w:tc>
+        <w:tc>
+          <w:tcPr>
+            <w:tcW w:type="dxa" w:w="3120"/>
+          </w:tcPr>
+          <w:p>
+            <w:r/>
+            <w:r>
+              <w:rPr>
+                <w:b w:val="0"/>
+                <w:sz w:val="20"/>
+              </w:rPr>
+              <w:t>2,49 J</w:t>
+            </w:r>
+          </w:p>
+        </w:tc>
+      </w:tr>
+      <w:tr>
+        <w:tc>
+          <w:tcPr>
+            <w:tcW w:type="dxa" w:w="3120"/>
           </w:tcPr>
           <w:p>
             <w:r/>
@@ -1538,7 +2123,7 @@
         </w:tc>
         <w:tc>
           <w:tcPr>
-            <w:tcW w:type="dxa" w:w="4680"/>
+            <w:tcW w:type="dxa" w:w="3120"/>
           </w:tcPr>
           <w:p>
             <w:r/>
@@ -1548,6 +2133,209 @@
                 <w:sz w:val="20"/>
               </w:rPr>
               <w:t>50/50 ảnh</w:t>
+            </w:r>
+          </w:p>
+        </w:tc>
+        <w:tc>
+          <w:tcPr>
+            <w:tcW w:type="dxa" w:w="3120"/>
+          </w:tcPr>
+          <w:p>
+            <w:r/>
+            <w:r>
+              <w:rPr>
+                <w:b w:val="0"/>
+                <w:sz w:val="20"/>
+              </w:rPr>
+              <w:t>50/50 ảnh</w:t>
+            </w:r>
+          </w:p>
+        </w:tc>
+      </w:tr>
+      <w:tr>
+        <w:tc>
+          <w:tcPr>
+            <w:tcW w:type="dxa" w:w="3120"/>
+          </w:tcPr>
+          <w:p>
+            <w:r/>
+            <w:r>
+              <w:rPr>
+                <w:b w:val="0"/>
+                <w:sz w:val="20"/>
+              </w:rPr>
+              <w:t>Thời gian đo liên tục</w:t>
+            </w:r>
+          </w:p>
+        </w:tc>
+        <w:tc>
+          <w:tcPr>
+            <w:tcW w:type="dxa" w:w="3120"/>
+          </w:tcPr>
+          <w:p>
+            <w:r/>
+            <w:r>
+              <w:rPr>
+                <w:b w:val="0"/>
+                <w:sz w:val="20"/>
+              </w:rPr>
+              <w:t>118,1 s</w:t>
+            </w:r>
+          </w:p>
+        </w:tc>
+        <w:tc>
+          <w:tcPr>
+            <w:tcW w:type="dxa" w:w="3120"/>
+          </w:tcPr>
+          <w:p>
+            <w:r/>
+            <w:r>
+              <w:rPr>
+                <w:b w:val="0"/>
+                <w:sz w:val="20"/>
+              </w:rPr>
+              <w:t>122,3 s</w:t>
+            </w:r>
+          </w:p>
+        </w:tc>
+      </w:tr>
+      <w:tr>
+        <w:tc>
+          <w:tcPr>
+            <w:tcW w:type="dxa" w:w="3120"/>
+          </w:tcPr>
+          <w:p>
+            <w:r/>
+            <w:r>
+              <w:rPr>
+                <w:b w:val="0"/>
+                <w:sz w:val="20"/>
+              </w:rPr>
+              <w:t>Mẫu bật bit 0 đến 2</w:t>
+            </w:r>
+          </w:p>
+        </w:tc>
+        <w:tc>
+          <w:tcPr>
+            <w:tcW w:type="dxa" w:w="3120"/>
+          </w:tcPr>
+          <w:p>
+            <w:r/>
+            <w:r>
+              <w:rPr>
+                <w:b w:val="0"/>
+                <w:sz w:val="20"/>
+              </w:rPr>
+              <w:t>0/114</w:t>
+            </w:r>
+          </w:p>
+        </w:tc>
+        <w:tc>
+          <w:tcPr>
+            <w:tcW w:type="dxa" w:w="3120"/>
+          </w:tcPr>
+          <w:p>
+            <w:r/>
+            <w:r>
+              <w:rPr>
+                <w:b w:val="0"/>
+                <w:sz w:val="20"/>
+              </w:rPr>
+              <w:t>0/118</w:t>
+            </w:r>
+          </w:p>
+        </w:tc>
+      </w:tr>
+      <w:tr>
+        <w:tc>
+          <w:tcPr>
+            <w:tcW w:type="dxa" w:w="3120"/>
+          </w:tcPr>
+          <w:p>
+            <w:r/>
+            <w:r>
+              <w:rPr>
+                <w:b w:val="0"/>
+                <w:sz w:val="20"/>
+              </w:rPr>
+              <w:t>Mẫu bật bit 3 (ngưỡng nhiệt mềm)</w:t>
+            </w:r>
+          </w:p>
+        </w:tc>
+        <w:tc>
+          <w:tcPr>
+            <w:tcW w:type="dxa" w:w="3120"/>
+          </w:tcPr>
+          <w:p>
+            <w:r/>
+            <w:r>
+              <w:rPr>
+                <w:b w:val="0"/>
+                <w:sz w:val="20"/>
+              </w:rPr>
+              <w:t>3/114</w:t>
+            </w:r>
+          </w:p>
+        </w:tc>
+        <w:tc>
+          <w:tcPr>
+            <w:tcW w:type="dxa" w:w="3120"/>
+          </w:tcPr>
+          <w:p>
+            <w:r/>
+            <w:r>
+              <w:rPr>
+                <w:b w:val="0"/>
+                <w:sz w:val="20"/>
+              </w:rPr>
+              <w:t>13/118</w:t>
+            </w:r>
+          </w:p>
+        </w:tc>
+      </w:tr>
+      <w:tr>
+        <w:tc>
+          <w:tcPr>
+            <w:tcW w:type="dxa" w:w="3120"/>
+          </w:tcPr>
+          <w:p>
+            <w:r/>
+            <w:r>
+              <w:rPr>
+                <w:b w:val="0"/>
+                <w:sz w:val="20"/>
+              </w:rPr>
+              <w:t>Xung CPU thấp nhất trong mốc</w:t>
+            </w:r>
+          </w:p>
+        </w:tc>
+        <w:tc>
+          <w:tcPr>
+            <w:tcW w:type="dxa" w:w="3120"/>
+          </w:tcPr>
+          <w:p>
+            <w:r/>
+            <w:r>
+              <w:rPr>
+                <w:b w:val="0"/>
+                <w:sz w:val="20"/>
+              </w:rPr>
+              <w:t>2400 MHz</w:t>
+            </w:r>
+          </w:p>
+        </w:tc>
+        <w:tc>
+          <w:tcPr>
+            <w:tcW w:type="dxa" w:w="3120"/>
+          </w:tcPr>
+          <w:p>
+            <w:r/>
+            <w:r>
+              <w:rPr>
+                <w:b w:val="0"/>
+                <w:sz w:val="20"/>
+              </w:rPr>
+              <w:t>2400 MHz</w:t>
             </w:r>
           </w:p>
         </w:tc>
@@ -1562,15 +2350,81 @@
         <w:rPr>
           <w:b w:val="0"/>
         </w:rPr>
-        <w:t>Hai dòng suy luận và đầu-cuối đo ở hai lần chạy khác nhau nên không trừ trực tiếp cho nhau; phần ngoài suy luận lấy từ cùng request trong lần đo qua API.</w:t>
+        <w:t>Bước kiểu dáng chỉ chạy khi model loại xe trả car và bước định vị tìm được vùng xe, tức 18/50 ảnh, trùng nhau ở hai cấu hình. So từng ảnh trong 18 ảnh này, ResNet18 chậm hơn MobileNetV3-Small từ 30,6 đến 68,5 ms, trung vị 51,3 ms. Ở 32 ảnh còn lại, hai lần chạy lệch nhau từ -18,7 đến 12,5 ms, là mức dao động giữa hai lần chạy. Phần lớn ảnh không qua bước kiểu dáng nên trung vị trên cả 50 ảnh của hai cấu hình gần bằng nhau, còn phân vị 90 thì khác rõ.</w:t>
       </w:r>
     </w:p>
     <w:p>
       <w:pPr/>
       <w:r>
         <w:rPr>
+          <w:b w:val="0"/>
+        </w:rPr>
+        <w:t>Về nhiệt độ, sau 1 đến 2 phút tải liên tục SoC lên 82 đến 83°C và bật bit 3 ở một số mẫu (bảng trên). Không mẫu nào bật bit 1 hoặc 2, xung CPU giữ 2400 MHz suốt cả hai mốc, và trung vị theo từng vòng trên 50 ảnh không tăng dần (467 đến 469 ms với MobileNetV3-Small, 463 đến 472 ms với ResNet18), nên nhóm vẫn dùng số của lần A. Trước MobileNetV3-Small, SoC đã nguội xuống 57,9°C trong lần nghỉ đầu; trước ResNet18, script chờ hết 5 phút mà nhiệt độ thấp nhất chỉ 59,5°C, chưa đạt điều kiện 58°C.</w:t>
+      </w:r>
+    </w:p>
+    <w:p>
+      <w:pPr/>
+      <w:r>
+        <w:rPr>
           <w:b/>
         </w:rPr>
+        <w:t>Bộ nhớ.</w:t>
+      </w:r>
+      <w:r>
+        <w:rPr>
+          <w:b w:val="0"/>
+        </w:rPr>
+        <w:t xml:space="preserve"> Tiến trình chạy benchmark_pipeline.py với 4 luồng dùng tối đa 705 đến 766 MiB (ru_maxrss, script run_pi_ram.sh, log pi5/ram_*.log). Tiến trình này nạp pipeline hai lần và nạp thêm các model đo riêng nên đây là cận trên. Cấu hình .pt + MobileNetV3-Small đang dùng chưa được đo riêng. Máy có 16GB RAM nên còn dư nhiều.</w:t>
+      </w:r>
+    </w:p>
+    <w:p>
+      <w:pPr/>
+      <w:r>
+        <w:rPr>
+          <w:b/>
+        </w:rPr>
+        <w:t>Hạn chế.</w:t>
+      </w:r>
+    </w:p>
+    <w:p>
+      <w:pPr>
+        <w:pStyle w:val="ListBullet"/>
+      </w:pPr>
+      <w:r>
+        <w:rPr>
+          <w:b w:val="0"/>
+        </w:rPr>
+        <w:t>Mỗi cấu hình chỉ chạy liên tục khoảng 2 phút ở lần A và 77 giây ở lần B. Chưa đo tải liên tục lâu hơn nên chưa biết khi đó CPU có bị hạ xung không.</w:t>
+      </w:r>
+    </w:p>
+    <w:p>
+      <w:pPr>
+        <w:pStyle w:val="ListBullet"/>
+      </w:pPr>
+      <w:r>
+        <w:rPr>
+          <w:b w:val="0"/>
+        </w:rPr>
+        <w:t>Điện năng đọc từ PMIC là cận dưới, chưa đối chiếu với đồng hồ đo USB-C ở ổ cắm.</w:t>
+      </w:r>
+    </w:p>
+    <w:p>
+      <w:pPr>
+        <w:pStyle w:val="ListBullet"/>
+      </w:pPr>
+      <w:r>
+        <w:rPr>
+          <w:b w:val="0"/>
+        </w:rPr>
+        <w:t>Độ trễ chưa gồm mạng LAN và thời gian lấy khung hình từ camera.</w:t>
+      </w:r>
+    </w:p>
+    <w:p>
+      <w:pPr/>
+      <w:r>
+        <w:rPr>
+          <w:b/>
+        </w:rPr>
         <w:t>Kết luận.</w:t>
       </w:r>
     </w:p>
@@ -1582,7 +2436,7 @@
         <w:rPr>
           <w:b w:val="0"/>
         </w:rPr>
-        <w:t>Đạt mốc đề cương: đầu-cuối 464 ms mỗi lượt (phân vị 90 là 494 ms), nhanh hơn mốc 2 giây khoảng 4 lần. Lượt đầu sau khi khởi động backend mất 4,8 giây vì nạp model; nạp sẵn model lúc khởi động sẽ tránh được độ trễ này.</w:t>
+        <w:t>Đạt mốc đề cương: đầu-cuối qua API 463,4 ms mỗi lượt, phân vị 90 là 487,9 ms, nhanh hơn mốc 2 giây khoảng 4 lần. Lượt đầu sau khi khởi động backend mất 4,8 giây vì nạp model; nạp sẵn model lúc khởi động sẽ tránh được độ trễ này.</w:t>
       </w:r>
     </w:p>
     <w:p>
@@ -1593,7 +2447,7 @@
         <w:rPr>
           <w:b w:val="0"/>
         </w:rPr>
-        <w:t>MobileNetV3-Small cho bước kiểu dáng: với ảnh ô tô, toàn pipeline giảm từ 537,4 ms (ResNet18) xuống 480,3 ms; accuracy không đổi (0,9007, bản ONNX khớp .pt trên 987/987 ảnh test).</w:t>
+        <w:t>Bước kiểu dáng dùng MobileNetV3-Small ONNX: accuracy ngang ResNet18 (0,9007 so với 0,8997), bản ONNX khớp .pt trên 987/987 ảnh test, và trên Pi mỗi ảnh có qua bước này nhanh hơn trung vị 51,3 ms.</w:t>
       </w:r>
     </w:p>
     <w:p>
@@ -1604,7 +2458,7 @@
         <w:rPr>
           <w:b w:val="0"/>
         </w:rPr>
-        <w:t>Kết quả nhận dạng trên Pi trùng máy dev ở cả 50 ảnh, nên model chạy trên ARM không lệch kết quả.</w:t>
+        <w:t>Kết quả nhận dạng trên Pi trùng máy dev ở cả 50 ảnh, cho cả hai cấu hình.</w:t>
       </w:r>
     </w:p>
     <w:p>
@@ -1615,7 +2469,18 @@
         <w:rPr>
           <w:b w:val="0"/>
         </w:rPr>
-        <w:t>4 luồng và .pt cho bước định vị xe chọn theo lần đo trước trên ảnh mẫu: 4 luồng nhanh nhất, bản .onnx chậm hơn .pt (535,0 so với 495,3 ms ở 4 luồng).</w:t>
+        <w:t>Điện năng 3,12 J mỗi lượt xe với cấu hình đang dùng.</w:t>
+      </w:r>
+    </w:p>
+    <w:p>
+      <w:pPr>
+        <w:pStyle w:val="ListBullet"/>
+      </w:pPr>
+      <w:r>
+        <w:rPr>
+          <w:b w:val="0"/>
+        </w:rPr>
+        <w:t>4 luồng và .pt cho bước định vị xe chọn theo lần đo ma trận trước đó trên ảnh mẫu 1_bomaich_detect.png (pi5/tong_hop.csv): 4 luồng nhanh nhất ở cả ba cấu hình, bản .onnx chậm hơn .pt (1.067,4 so với 813,9 ms ở 1 luồng, 535,0 so với 495,3 ms ở 4 luồng).</w:t>
       </w:r>
     </w:p>
     <w:p>
@@ -1796,7 +2661,7 @@
         <w:rPr>
           <w:b w:val="0"/>
         </w:rPr>
-        <w:t>Đo trên Raspberry Pi 5 thật với 50 ảnh camera cổng: đầu-cuối qua API 464 ms mỗi lượt (phân vị 90 là 494 ms), nhanh hơn mốc 2 giây của đề cương khoảng 4 lần; điện năng khoảng 3,1 J mỗi lượt xe; kết quả nhận dạng trùng máy dev ở cả 50 ảnh. Xuất MobileNetV3-Small ONNX cho bước kiểu dáng (khớp .pt 987/987 ảnh), ảnh ô tô nhanh hơn 57 ms mỗi lượt.</w:t>
+        <w:t>Đo trên Raspberry Pi 5 thật với 50 ảnh camera cổng: đầu-cuối qua API 463,4 ms mỗi lượt (phân vị 90 là 487,9 ms), nhanh hơn mốc 2 giây của đề cương khoảng 4 lần; điện năng 3,12 J mỗi lượt xe; kết quả nhận dạng trùng máy dev ở cả 50 ảnh. Bước kiểu dáng chuyển sang MobileNetV3-Small ONNX (khớp .pt 987/987 ảnh), nhanh hơn ResNet18 trung vị 51,3 ms trên mỗi ảnh có qua bước này.</w:t>
       </w:r>
     </w:p>
     <w:sectPr>

</xml_diff>